<commit_message>
refactor: remove src directory, transition to monolithic kaggle scripts, and update project documentation
</commit_message>
<xml_diff>
--- a/model_comparison_report.docx
+++ b/model_comparison_report.docx
@@ -2,13 +2,37 @@
 <file path=word/document.xml><?xml version="1.0" encoding="utf-8"?>
 <w:document xmlns:w="http://schemas.openxmlformats.org/wordprocessingml/2006/main" xmlns:m="http://schemas.openxmlformats.org/officeDocument/2006/math" xmlns:r="http://schemas.openxmlformats.org/officeDocument/2006/relationships" xmlns:o="urn:schemas-microsoft-com:office:office" xmlns:v="urn:schemas-microsoft-com:vml" xmlns:w10="urn:schemas-microsoft-com:office:word" xmlns:a="http://schemas.openxmlformats.org/drawingml/2006/main" xmlns:pic="http://schemas.openxmlformats.org/drawingml/2006/picture" xmlns:wp="http://schemas.openxmlformats.org/drawingml/2006/wordprocessingDrawing">
   <w:body>
-    <w:bookmarkStart w:id="20" w:name="baseline-model-comparison-report"/>
-    <w:p>
-      <w:pPr>
-        <w:pStyle w:val="Heading1"/>
-      </w:pPr>
-      <w:r>
-        <w:t xml:space="preserve">Baseline Model Comparison Report</w:t>
+    <w:p>
+      <w:pPr>
+        <w:pStyle w:val="Title"/>
+      </w:pPr>
+      <w:r>
+        <w:t xml:space="preserve">Autism Facial Emotion Recognition</w:t>
+      </w:r>
+    </w:p>
+    <w:p>
+      <w:pPr>
+        <w:pStyle w:val="Subtitle"/>
+      </w:pPr>
+      <w:r>
+        <w:t xml:space="preserve">Project Progress &amp; Baseline Model Comparison</w:t>
+      </w:r>
+    </w:p>
+    <w:p>
+      <w:pPr>
+        <w:pStyle w:val="Date"/>
+      </w:pPr>
+      <w:r>
+        <w:t xml:space="preserve">August 2026</w:t>
+      </w:r>
+    </w:p>
+    <w:bookmarkStart w:id="9" w:name="abstract"/>
+    <w:p>
+      <w:pPr>
+        <w:pStyle w:val="Heading2"/>
+      </w:pPr>
+      <w:r>
+        <w:t xml:space="preserve">Abstract</w:t>
       </w:r>
     </w:p>
     <w:p>
@@ -16,16 +40,940 @@
         <w:pStyle w:val="FirstParagraph"/>
       </w:pPr>
       <w:r>
-        <w:t xml:space="preserve">This report summarizes the performance of 9 baseline models evaluated on the Autism Facial Expression Recognition dataset. The objective of this phase was to determine how well standard convolutional and transformer-based architectures can classify 6 distinct emotions (anger, fear, joy, natural, sadness, surprise) directly from raw images, establishing a benchmark for future architectural improvements.</w:t>
-      </w:r>
-    </w:p>
-    <w:bookmarkStart w:id="9" w:name="summary-table"/>
+        <w:t xml:space="preserve">This report documents the current state of a research project to develop a deep-learning framework that accurately classifies six fundamental facial emotions (anger, fear, joy, natural, sadness, surprise) in children with Autism Spectrum Disorder (ASD). Because children with ASD exhibit atypical facial dynamics (e.g., reduced symmetry, asynchronous activation), standard emotion-recognition models often struggle. We aggregate four small ASD-specific datasets into a unified corpus, benchmark ten standard CNN and Transformer baselines under stratified 5-fold cross-validation, and motivate a hybrid architecture for the next phase.</w:t>
+      </w:r>
+    </w:p>
+    <w:p>
+      <w:r>
+        <w:pict>
+          <v:rect style="width:0;height:1.5pt" o:hralign="center" o:hrstd="t" o:hr="t"/>
+        </w:pict>
+      </w:r>
+    </w:p>
+    <w:bookmarkEnd w:id="9"/>
+    <w:bookmarkStart w:id="10" w:name="project-overview"/>
     <w:p>
       <w:pPr>
         <w:pStyle w:val="Heading2"/>
       </w:pPr>
       <w:r>
-        <w:t xml:space="preserve">Summary Table</w:t>
+        <w:t xml:space="preserve">1. Project Overview</w:t>
+      </w:r>
+    </w:p>
+    <w:p>
+      <w:pPr>
+        <w:pStyle w:val="FirstParagraph"/>
+      </w:pPr>
+      <w:r>
+        <w:t xml:space="preserve">The goal of this research is to develop a deep learning framework to accurately classify six fundamental facial emotions (</w:t>
+      </w:r>
+      <w:r>
+        <w:rPr>
+          <w:b/>
+          <w:bCs/>
+        </w:rPr>
+        <w:t xml:space="preserve">anger, fear, joy, natural, sadness, surprise</w:t>
+      </w:r>
+      <w:r>
+        <w:t xml:space="preserve">) in children with Autism Spectrum Disorder (ASD). Because children with ASD exhibit atypical facial dynamics (e.g., reduced symmetry, asynchronous activation), standard emotion recognition models often struggle to generalize to this population.</w:t>
+      </w:r>
+    </w:p>
+    <w:p>
+      <w:pPr>
+        <w:pStyle w:val="BodyText"/>
+      </w:pPr>
+      <w:r>
+        <w:t xml:space="preserve">The current phase establishes a rigorous</w:t>
+      </w:r>
+      <w:r>
+        <w:t xml:space="preserve"> </w:t>
+      </w:r>
+      <w:r>
+        <w:rPr>
+          <w:b/>
+          <w:bCs/>
+        </w:rPr>
+        <w:t xml:space="preserve">baseline benchmark</w:t>
+      </w:r>
+      <w:r>
+        <w:t xml:space="preserve">. We evaluate ten standard CNN and Transformer architectures on a unified, cleaned dataset using stratified 5-fold cross-validation. This benchmark defines the target performance threshold that our proposed hybrid architecture must exceed in the next phase.</w:t>
+      </w:r>
+    </w:p>
+    <w:p>
+      <w:r>
+        <w:pict>
+          <v:rect style="width:0;height:1.5pt" o:hralign="center" o:hrstd="t" o:hr="t"/>
+        </w:pict>
+      </w:r>
+    </w:p>
+    <w:bookmarkEnd w:id="10"/>
+    <w:bookmarkStart w:id="17" w:name="dataset"/>
+    <w:p>
+      <w:pPr>
+        <w:pStyle w:val="Heading2"/>
+      </w:pPr>
+      <w:r>
+        <w:t xml:space="preserve">2. Dataset</w:t>
+      </w:r>
+    </w:p>
+    <w:p>
+      <w:pPr>
+        <w:pStyle w:val="FirstParagraph"/>
+      </w:pPr>
+      <w:r>
+        <w:t xml:space="preserve">Our</w:t>
+      </w:r>
+      <w:r>
+        <w:t xml:space="preserve"> </w:t>
+      </w:r>
+      <w:r>
+        <w:rPr>
+          <w:b/>
+          <w:bCs/>
+        </w:rPr>
+        <w:t xml:space="preserve">primary dataset</w:t>
+      </w:r>
+      <w:r>
+        <w:t xml:space="preserve"> </w:t>
+      </w:r>
+      <w:r>
+        <w:t xml:space="preserve">is</w:t>
+      </w:r>
+      <w:r>
+        <w:t xml:space="preserve"> </w:t>
+      </w:r>
+      <w:hyperlink r:id="rId11">
+        <w:r>
+          <w:rPr>
+            <w:rStyle w:val="Hyperlink"/>
+          </w:rPr>
+          <w:t xml:space="preserve">Nora Mahmoud’s Mendeley Dataset</w:t>
+        </w:r>
+      </w:hyperlink>
+      <w:r>
+        <w:t xml:space="preserve">. Because ASD facial datasets are inherently small, we strategically merged the primary dataset with three other sources. This aggregation significantly increased the total number of images, allowing our models to learn more robust and generalized ASD-specific facial cues.</w:t>
+      </w:r>
+    </w:p>
+    <w:bookmarkStart w:id="15" w:name="data-sources"/>
+    <w:p>
+      <w:pPr>
+        <w:pStyle w:val="Heading3"/>
+      </w:pPr>
+      <w:r>
+        <w:t xml:space="preserve">2.1 Data Sources</w:t>
+      </w:r>
+    </w:p>
+    <w:p>
+      <w:pPr>
+        <w:pStyle w:val="FirstParagraph"/>
+      </w:pPr>
+      <w:r>
+        <w:t xml:space="preserve">The unified corpus is aggregated from the following four sources:</w:t>
+      </w:r>
+    </w:p>
+    <w:tbl>
+      <w:tblPr>
+        <w:tblStyle w:val="Table"/>
+        <w:tblW w:type="pct" w:w="5000"/>
+        <w:tblLayout w:type="fixed"/>
+        <w:tblLook w:firstRow="1" w:lastRow="0" w:firstColumn="0" w:lastColumn="0" w:noHBand="0" w:noVBand="0" w:val="0020"/>
+      </w:tblPr>
+      <w:tblGrid>
+        <w:gridCol w:w="3017"/>
+        <w:gridCol w:w="4902"/>
+      </w:tblGrid>
+      <w:tr>
+        <w:trPr>
+          <w:tblHeader w:val="on"/>
+        </w:trPr>
+        <w:tc>
+          <w:tcPr/>
+          <w:p>
+            <w:pPr>
+              <w:pStyle w:val="Compact"/>
+            </w:pPr>
+            <w:r>
+              <w:t xml:space="preserve">Source</w:t>
+            </w:r>
+          </w:p>
+        </w:tc>
+        <w:tc>
+          <w:tcPr/>
+          <w:p>
+            <w:pPr>
+              <w:pStyle w:val="Compact"/>
+            </w:pPr>
+            <w:r>
+              <w:t xml:space="preserve">Description</w:t>
+            </w:r>
+          </w:p>
+        </w:tc>
+      </w:tr>
+      <w:tr>
+        <w:tc>
+          <w:tcPr/>
+          <w:p>
+            <w:pPr>
+              <w:pStyle w:val="Compact"/>
+            </w:pPr>
+            <w:hyperlink r:id="rId11">
+              <w:r>
+                <w:rPr>
+                  <w:rStyle w:val="Hyperlink"/>
+                </w:rPr>
+                <w:t xml:space="preserve">Nora Mahmoud’s Mendeley Dataset</w:t>
+              </w:r>
+            </w:hyperlink>
+          </w:p>
+        </w:tc>
+        <w:tc>
+          <w:tcPr/>
+          <w:p>
+            <w:pPr>
+              <w:pStyle w:val="Compact"/>
+            </w:pPr>
+            <w:r>
+              <w:rPr>
+                <w:b/>
+                <w:bCs/>
+              </w:rPr>
+              <w:t xml:space="preserve">Primary Dataset:</w:t>
+            </w:r>
+            <w:r>
+              <w:t xml:space="preserve"> </w:t>
+            </w:r>
+            <w:r>
+              <w:t xml:space="preserve">6-class facial emotion categories</w:t>
+            </w:r>
+          </w:p>
+        </w:tc>
+      </w:tr>
+      <w:tr>
+        <w:tc>
+          <w:tcPr/>
+          <w:p>
+            <w:pPr>
+              <w:pStyle w:val="Compact"/>
+            </w:pPr>
+            <w:hyperlink r:id="rId12">
+              <w:r>
+                <w:rPr>
+                  <w:rStyle w:val="Hyperlink"/>
+                </w:rPr>
+                <w:t xml:space="preserve">FERAC Dataset</w:t>
+              </w:r>
+            </w:hyperlink>
+          </w:p>
+        </w:tc>
+        <w:tc>
+          <w:tcPr/>
+          <w:p>
+            <w:pPr>
+              <w:pStyle w:val="Compact"/>
+            </w:pPr>
+            <w:r>
+              <w:t xml:space="preserve">4-class ASD facial expressions</w:t>
+            </w:r>
+          </w:p>
+        </w:tc>
+      </w:tr>
+      <w:tr>
+        <w:tc>
+          <w:tcPr/>
+          <w:p>
+            <w:pPr>
+              <w:pStyle w:val="Compact"/>
+            </w:pPr>
+            <w:hyperlink r:id="rId13">
+              <w:r>
+                <w:rPr>
+                  <w:rStyle w:val="Hyperlink"/>
+                </w:rPr>
+                <w:t xml:space="preserve">Dr. Fatma M. Talaat (Kaggle)</w:t>
+              </w:r>
+            </w:hyperlink>
+          </w:p>
+        </w:tc>
+        <w:tc>
+          <w:tcPr/>
+          <w:p>
+            <w:pPr>
+              <w:pStyle w:val="Compact"/>
+            </w:pPr>
+            <w:r>
+              <w:t xml:space="preserve">ASD facial emotion data</w:t>
+            </w:r>
+          </w:p>
+        </w:tc>
+      </w:tr>
+      <w:tr>
+        <w:tc>
+          <w:tcPr/>
+          <w:p>
+            <w:pPr>
+              <w:pStyle w:val="Compact"/>
+            </w:pPr>
+            <w:hyperlink r:id="rId14">
+              <w:r>
+                <w:rPr>
+                  <w:rStyle w:val="Hyperlink"/>
+                </w:rPr>
+                <w:t xml:space="preserve">Hasibur Rahman’s Kaggle Dataset</w:t>
+              </w:r>
+            </w:hyperlink>
+          </w:p>
+        </w:tc>
+        <w:tc>
+          <w:tcPr/>
+          <w:p>
+            <w:pPr>
+              <w:pStyle w:val="Compact"/>
+            </w:pPr>
+            <w:r>
+              <w:t xml:space="preserve">ASD facial expression samples</w:t>
+            </w:r>
+          </w:p>
+        </w:tc>
+      </w:tr>
+    </w:tbl>
+    <w:bookmarkEnd w:id="15"/>
+    <w:bookmarkStart w:id="16" w:name="cleaning-splitting"/>
+    <w:p>
+      <w:pPr>
+        <w:pStyle w:val="Heading3"/>
+      </w:pPr>
+      <w:r>
+        <w:t xml:space="preserve">2.2 Cleaning &amp; Splitting</w:t>
+      </w:r>
+    </w:p>
+    <w:p>
+      <w:pPr>
+        <w:pStyle w:val="Compact"/>
+        <w:numPr>
+          <w:ilvl w:val="0"/>
+          <w:numId w:val="1001"/>
+        </w:numPr>
+      </w:pPr>
+      <w:r>
+        <w:rPr>
+          <w:b/>
+          <w:bCs/>
+        </w:rPr>
+        <w:t xml:space="preserve">Cleaning:</w:t>
+      </w:r>
+      <w:r>
+        <w:t xml:space="preserve"> </w:t>
+      </w:r>
+      <w:r>
+        <w:t xml:space="preserve">We took only the unique, raw images from all collected datasets and combined them to create a new, clean dataset (</w:t>
+      </w:r>
+      <w:r>
+        <w:rPr>
+          <w:rStyle w:val="VerbatimChar"/>
+        </w:rPr>
+        <w:t xml:space="preserve">dataset_clean/</w:t>
+      </w:r>
+      <w:r>
+        <w:t xml:space="preserve">).</w:t>
+      </w:r>
+    </w:p>
+    <w:p>
+      <w:pPr>
+        <w:pStyle w:val="Compact"/>
+        <w:numPr>
+          <w:ilvl w:val="0"/>
+          <w:numId w:val="1001"/>
+        </w:numPr>
+      </w:pPr>
+      <w:r>
+        <w:rPr>
+          <w:b/>
+          <w:bCs/>
+        </w:rPr>
+        <w:t xml:space="preserve">Splitting:</w:t>
+      </w:r>
+      <w:r>
+        <w:t xml:space="preserve"> </w:t>
+      </w:r>
+      <w:r>
+        <w:t xml:space="preserve">The cleaned images were then unified and stratified into a</w:t>
+      </w:r>
+      <w:r>
+        <w:t xml:space="preserve"> </w:t>
+      </w:r>
+      <w:r>
+        <w:rPr>
+          <w:b/>
+          <w:bCs/>
+        </w:rPr>
+        <w:t xml:space="preserve">70/15/15</w:t>
+      </w:r>
+      <w:r>
+        <w:t xml:space="preserve"> </w:t>
+      </w:r>
+      <w:r>
+        <w:t xml:space="preserve">ratio (Train / Validation / Test).</w:t>
+      </w:r>
+    </w:p>
+    <w:p>
+      <w:pPr>
+        <w:pStyle w:val="FirstParagraph"/>
+      </w:pPr>
+      <w:r>
+        <w:rPr>
+          <w:b/>
+          <w:bCs/>
+        </w:rPr>
+        <w:t xml:space="preserve">Final per-class split</w:t>
+      </w:r>
+      <w:r>
+        <w:t xml:space="preserve"> </w:t>
+      </w:r>
+      <w:r>
+        <w:t xml:space="preserve">(</w:t>
+      </w:r>
+      <w:r>
+        <w:rPr>
+          <w:rStyle w:val="VerbatimChar"/>
+        </w:rPr>
+        <w:t xml:space="preserve">dataset/</w:t>
+      </w:r>
+      <w:r>
+        <w:t xml:space="preserve">):</w:t>
+      </w:r>
+    </w:p>
+    <w:tbl>
+      <w:tblPr>
+        <w:tblStyle w:val="Table"/>
+        <w:tblW w:type="pct" w:w="5000"/>
+        <w:tblLayout w:type="fixed"/>
+        <w:tblLook w:firstRow="1" w:lastRow="0" w:firstColumn="0" w:lastColumn="0" w:noHBand="0" w:noVBand="0" w:val="0020"/>
+      </w:tblPr>
+      <w:tblGrid>
+        <w:gridCol w:w="924"/>
+        <w:gridCol w:w="924"/>
+        <w:gridCol w:w="792"/>
+        <w:gridCol w:w="660"/>
+        <w:gridCol w:w="1188"/>
+        <w:gridCol w:w="1188"/>
+        <w:gridCol w:w="1320"/>
+        <w:gridCol w:w="924"/>
+      </w:tblGrid>
+      <w:tr>
+        <w:trPr>
+          <w:tblHeader w:val="on"/>
+        </w:trPr>
+        <w:tc>
+          <w:tcPr/>
+          <w:p>
+            <w:pPr>
+              <w:pStyle w:val="Compact"/>
+            </w:pPr>
+            <w:r>
+              <w:t xml:space="preserve">Split</w:t>
+            </w:r>
+          </w:p>
+        </w:tc>
+        <w:tc>
+          <w:tcPr/>
+          <w:p>
+            <w:pPr>
+              <w:pStyle w:val="Compact"/>
+              <w:jc w:val="right"/>
+            </w:pPr>
+            <w:r>
+              <w:t xml:space="preserve">anger</w:t>
+            </w:r>
+          </w:p>
+        </w:tc>
+        <w:tc>
+          <w:tcPr/>
+          <w:p>
+            <w:pPr>
+              <w:pStyle w:val="Compact"/>
+              <w:jc w:val="right"/>
+            </w:pPr>
+            <w:r>
+              <w:t xml:space="preserve">fear</w:t>
+            </w:r>
+          </w:p>
+        </w:tc>
+        <w:tc>
+          <w:tcPr/>
+          <w:p>
+            <w:pPr>
+              <w:pStyle w:val="Compact"/>
+              <w:jc w:val="right"/>
+            </w:pPr>
+            <w:r>
+              <w:t xml:space="preserve">joy</w:t>
+            </w:r>
+          </w:p>
+        </w:tc>
+        <w:tc>
+          <w:tcPr/>
+          <w:p>
+            <w:pPr>
+              <w:pStyle w:val="Compact"/>
+              <w:jc w:val="right"/>
+            </w:pPr>
+            <w:r>
+              <w:t xml:space="preserve">natural</w:t>
+            </w:r>
+          </w:p>
+        </w:tc>
+        <w:tc>
+          <w:tcPr/>
+          <w:p>
+            <w:pPr>
+              <w:pStyle w:val="Compact"/>
+              <w:jc w:val="right"/>
+            </w:pPr>
+            <w:r>
+              <w:t xml:space="preserve">sadness</w:t>
+            </w:r>
+          </w:p>
+        </w:tc>
+        <w:tc>
+          <w:tcPr/>
+          <w:p>
+            <w:pPr>
+              <w:pStyle w:val="Compact"/>
+              <w:jc w:val="right"/>
+            </w:pPr>
+            <w:r>
+              <w:t xml:space="preserve">surprise</w:t>
+            </w:r>
+          </w:p>
+        </w:tc>
+        <w:tc>
+          <w:tcPr/>
+          <w:p>
+            <w:pPr>
+              <w:pStyle w:val="Compact"/>
+              <w:jc w:val="right"/>
+            </w:pPr>
+            <w:r>
+              <w:t xml:space="preserve">Total</w:t>
+            </w:r>
+          </w:p>
+        </w:tc>
+      </w:tr>
+      <w:tr>
+        <w:tc>
+          <w:tcPr/>
+          <w:p>
+            <w:pPr>
+              <w:pStyle w:val="Compact"/>
+            </w:pPr>
+            <w:r>
+              <w:t xml:space="preserve">Train</w:t>
+            </w:r>
+          </w:p>
+        </w:tc>
+        <w:tc>
+          <w:tcPr/>
+          <w:p>
+            <w:pPr>
+              <w:pStyle w:val="Compact"/>
+              <w:jc w:val="right"/>
+            </w:pPr>
+            <w:r>
+              <w:t xml:space="preserve">147</w:t>
+            </w:r>
+          </w:p>
+        </w:tc>
+        <w:tc>
+          <w:tcPr/>
+          <w:p>
+            <w:pPr>
+              <w:pStyle w:val="Compact"/>
+              <w:jc w:val="right"/>
+            </w:pPr>
+            <w:r>
+              <w:t xml:space="preserve">60</w:t>
+            </w:r>
+          </w:p>
+        </w:tc>
+        <w:tc>
+          <w:tcPr/>
+          <w:p>
+            <w:pPr>
+              <w:pStyle w:val="Compact"/>
+              <w:jc w:val="right"/>
+            </w:pPr>
+            <w:r>
+              <w:t xml:space="preserve">602</w:t>
+            </w:r>
+          </w:p>
+        </w:tc>
+        <w:tc>
+          <w:tcPr/>
+          <w:p>
+            <w:pPr>
+              <w:pStyle w:val="Compact"/>
+              <w:jc w:val="right"/>
+            </w:pPr>
+            <w:r>
+              <w:t xml:space="preserve">161</w:t>
+            </w:r>
+          </w:p>
+        </w:tc>
+        <w:tc>
+          <w:tcPr/>
+          <w:p>
+            <w:pPr>
+              <w:pStyle w:val="Compact"/>
+              <w:jc w:val="right"/>
+            </w:pPr>
+            <w:r>
+              <w:t xml:space="preserve">321</w:t>
+            </w:r>
+          </w:p>
+        </w:tc>
+        <w:tc>
+          <w:tcPr/>
+          <w:p>
+            <w:pPr>
+              <w:pStyle w:val="Compact"/>
+              <w:jc w:val="right"/>
+            </w:pPr>
+            <w:r>
+              <w:t xml:space="preserve">109</w:t>
+            </w:r>
+          </w:p>
+        </w:tc>
+        <w:tc>
+          <w:tcPr/>
+          <w:p>
+            <w:pPr>
+              <w:pStyle w:val="Compact"/>
+              <w:jc w:val="right"/>
+            </w:pPr>
+            <w:r>
+              <w:rPr>
+                <w:b/>
+                <w:bCs/>
+              </w:rPr>
+              <w:t xml:space="preserve">1,400</w:t>
+            </w:r>
+          </w:p>
+        </w:tc>
+      </w:tr>
+      <w:tr>
+        <w:tc>
+          <w:tcPr/>
+          <w:p>
+            <w:pPr>
+              <w:pStyle w:val="Compact"/>
+            </w:pPr>
+            <w:r>
+              <w:t xml:space="preserve">Valid</w:t>
+            </w:r>
+          </w:p>
+        </w:tc>
+        <w:tc>
+          <w:tcPr/>
+          <w:p>
+            <w:pPr>
+              <w:pStyle w:val="Compact"/>
+              <w:jc w:val="right"/>
+            </w:pPr>
+            <w:r>
+              <w:t xml:space="preserve">31</w:t>
+            </w:r>
+          </w:p>
+        </w:tc>
+        <w:tc>
+          <w:tcPr/>
+          <w:p>
+            <w:pPr>
+              <w:pStyle w:val="Compact"/>
+              <w:jc w:val="right"/>
+            </w:pPr>
+            <w:r>
+              <w:t xml:space="preserve">13</w:t>
+            </w:r>
+          </w:p>
+        </w:tc>
+        <w:tc>
+          <w:tcPr/>
+          <w:p>
+            <w:pPr>
+              <w:pStyle w:val="Compact"/>
+              <w:jc w:val="right"/>
+            </w:pPr>
+            <w:r>
+              <w:t xml:space="preserve">129</w:t>
+            </w:r>
+          </w:p>
+        </w:tc>
+        <w:tc>
+          <w:tcPr/>
+          <w:p>
+            <w:pPr>
+              <w:pStyle w:val="Compact"/>
+              <w:jc w:val="right"/>
+            </w:pPr>
+            <w:r>
+              <w:t xml:space="preserve">34</w:t>
+            </w:r>
+          </w:p>
+        </w:tc>
+        <w:tc>
+          <w:tcPr/>
+          <w:p>
+            <w:pPr>
+              <w:pStyle w:val="Compact"/>
+              <w:jc w:val="right"/>
+            </w:pPr>
+            <w:r>
+              <w:t xml:space="preserve">69</w:t>
+            </w:r>
+          </w:p>
+        </w:tc>
+        <w:tc>
+          <w:tcPr/>
+          <w:p>
+            <w:pPr>
+              <w:pStyle w:val="Compact"/>
+              <w:jc w:val="right"/>
+            </w:pPr>
+            <w:r>
+              <w:t xml:space="preserve">23</w:t>
+            </w:r>
+          </w:p>
+        </w:tc>
+        <w:tc>
+          <w:tcPr/>
+          <w:p>
+            <w:pPr>
+              <w:pStyle w:val="Compact"/>
+              <w:jc w:val="right"/>
+            </w:pPr>
+            <w:r>
+              <w:rPr>
+                <w:b/>
+                <w:bCs/>
+              </w:rPr>
+              <w:t xml:space="preserve">299</w:t>
+            </w:r>
+          </w:p>
+        </w:tc>
+      </w:tr>
+      <w:tr>
+        <w:tc>
+          <w:tcPr/>
+          <w:p>
+            <w:pPr>
+              <w:pStyle w:val="Compact"/>
+            </w:pPr>
+            <w:r>
+              <w:t xml:space="preserve">Test</w:t>
+            </w:r>
+          </w:p>
+        </w:tc>
+        <w:tc>
+          <w:tcPr/>
+          <w:p>
+            <w:pPr>
+              <w:pStyle w:val="Compact"/>
+              <w:jc w:val="right"/>
+            </w:pPr>
+            <w:r>
+              <w:t xml:space="preserve">32</w:t>
+            </w:r>
+          </w:p>
+        </w:tc>
+        <w:tc>
+          <w:tcPr/>
+          <w:p>
+            <w:pPr>
+              <w:pStyle w:val="Compact"/>
+              <w:jc w:val="right"/>
+            </w:pPr>
+            <w:r>
+              <w:t xml:space="preserve">14</w:t>
+            </w:r>
+          </w:p>
+        </w:tc>
+        <w:tc>
+          <w:tcPr/>
+          <w:p>
+            <w:pPr>
+              <w:pStyle w:val="Compact"/>
+              <w:jc w:val="right"/>
+            </w:pPr>
+            <w:r>
+              <w:t xml:space="preserve">130</w:t>
+            </w:r>
+          </w:p>
+        </w:tc>
+        <w:tc>
+          <w:tcPr/>
+          <w:p>
+            <w:pPr>
+              <w:pStyle w:val="Compact"/>
+              <w:jc w:val="right"/>
+            </w:pPr>
+            <w:r>
+              <w:t xml:space="preserve">35</w:t>
+            </w:r>
+          </w:p>
+        </w:tc>
+        <w:tc>
+          <w:tcPr/>
+          <w:p>
+            <w:pPr>
+              <w:pStyle w:val="Compact"/>
+              <w:jc w:val="right"/>
+            </w:pPr>
+            <w:r>
+              <w:t xml:space="preserve">69</w:t>
+            </w:r>
+          </w:p>
+        </w:tc>
+        <w:tc>
+          <w:tcPr/>
+          <w:p>
+            <w:pPr>
+              <w:pStyle w:val="Compact"/>
+              <w:jc w:val="right"/>
+            </w:pPr>
+            <w:r>
+              <w:t xml:space="preserve">24</w:t>
+            </w:r>
+          </w:p>
+        </w:tc>
+        <w:tc>
+          <w:tcPr/>
+          <w:p>
+            <w:pPr>
+              <w:pStyle w:val="Compact"/>
+              <w:jc w:val="right"/>
+            </w:pPr>
+            <w:r>
+              <w:rPr>
+                <w:b/>
+                <w:bCs/>
+              </w:rPr>
+              <w:t xml:space="preserve">304</w:t>
+            </w:r>
+          </w:p>
+        </w:tc>
+      </w:tr>
+    </w:tbl>
+    <w:p>
+      <w:pPr>
+        <w:pStyle w:val="BlockText"/>
+      </w:pPr>
+      <w:r>
+        <w:rPr>
+          <w:b/>
+          <w:bCs/>
+        </w:rPr>
+        <w:t xml:space="preserve">Class imbalance:</w:t>
+      </w:r>
+      <w:r>
+        <w:t xml:space="preserve"> </w:t>
+      </w:r>
+      <w:r>
+        <w:t xml:space="preserve">joy (602) vs fear (60) is a 10:1 ratio. This is mitigated via a</w:t>
+      </w:r>
+      <w:r>
+        <w:t xml:space="preserve"> </w:t>
+      </w:r>
+      <w:r>
+        <w:rPr>
+          <w:rStyle w:val="VerbatimChar"/>
+        </w:rPr>
+        <w:t xml:space="preserve">WeightedRandomSampler</w:t>
+      </w:r>
+      <w:r>
+        <w:t xml:space="preserve"> </w:t>
+      </w:r>
+      <w:r>
+        <w:t xml:space="preserve">at the DataLoader level (loss is left unweighted to avoid double-weighting).</w:t>
+      </w:r>
+    </w:p>
+    <w:p>
+      <w:r>
+        <w:pict>
+          <v:rect style="width:0;height:1.5pt" o:hralign="center" o:hrstd="t" o:hr="t"/>
+        </w:pict>
+      </w:r>
+    </w:p>
+    <w:bookmarkEnd w:id="16"/>
+    <w:bookmarkEnd w:id="17"/>
+    <w:bookmarkStart w:id="19" w:name="baseline-model-comparison"/>
+    <w:p>
+      <w:pPr>
+        <w:pStyle w:val="Heading2"/>
+      </w:pPr>
+      <w:r>
+        <w:t xml:space="preserve">3. Baseline Model Comparison</w:t>
+      </w:r>
+    </w:p>
+    <w:p>
+      <w:pPr>
+        <w:pStyle w:val="FirstParagraph"/>
+      </w:pPr>
+      <w:r>
+        <w:t xml:space="preserve">We evaluated</w:t>
+      </w:r>
+      <w:r>
+        <w:t xml:space="preserve"> </w:t>
+      </w:r>
+      <w:r>
+        <w:rPr>
+          <w:b/>
+          <w:bCs/>
+        </w:rPr>
+        <w:t xml:space="preserve">10 standard baseline models</w:t>
+      </w:r>
+      <w:r>
+        <w:t xml:space="preserve"> </w:t>
+      </w:r>
+      <w:r>
+        <w:t xml:space="preserve">on the unaugmented raw dataset using a</w:t>
+      </w:r>
+      <w:r>
+        <w:t xml:space="preserve"> </w:t>
+      </w:r>
+      <w:r>
+        <w:rPr>
+          <w:b/>
+          <w:bCs/>
+        </w:rPr>
+        <w:t xml:space="preserve">Stratified 5-Fold Cross-Validation</w:t>
+      </w:r>
+      <w:r>
+        <w:t xml:space="preserve"> </w:t>
+      </w:r>
+      <w:r>
+        <w:t xml:space="preserve">approach to establish our benchmark. Every image is predicted exactly once out-of-fold (OOF), making metrics for rare classes (such as</w:t>
+      </w:r>
+      <w:r>
+        <w:t xml:space="preserve"> </w:t>
+      </w:r>
+      <w:r>
+        <w:rPr>
+          <w:i/>
+          <w:iCs/>
+        </w:rPr>
+        <w:t xml:space="preserve">fear</w:t>
+      </w:r>
+      <w:r>
+        <w:t xml:space="preserve">) statistically defensible.</w:t>
+      </w:r>
+    </w:p>
+    <w:bookmarkStart w:id="18" w:name="summary-table"/>
+    <w:p>
+      <w:pPr>
+        <w:pStyle w:val="Heading3"/>
+      </w:pPr>
+      <w:r>
+        <w:t xml:space="preserve">3.1 Summary Table</w:t>
       </w:r>
     </w:p>
     <w:tbl>
@@ -61,6 +1009,7 @@
           <w:p>
             <w:pPr>
               <w:pStyle w:val="Compact"/>
+              <w:jc w:val="right"/>
             </w:pPr>
             <w:r>
               <w:t xml:space="preserve">Accuracy</w:t>
@@ -72,6 +1021,7 @@
           <w:p>
             <w:pPr>
               <w:pStyle w:val="Compact"/>
+              <w:jc w:val="right"/>
             </w:pPr>
             <w:r>
               <w:t xml:space="preserve">F1-Macro</w:t>
@@ -83,6 +1033,7 @@
           <w:p>
             <w:pPr>
               <w:pStyle w:val="Compact"/>
+              <w:jc w:val="right"/>
             </w:pPr>
             <w:r>
               <w:t xml:space="preserve">Precision</w:t>
@@ -94,6 +1045,7 @@
           <w:p>
             <w:pPr>
               <w:pStyle w:val="Compact"/>
+              <w:jc w:val="right"/>
             </w:pPr>
             <w:r>
               <w:t xml:space="preserve">Recall</w:t>
@@ -122,6 +1074,7 @@
           <w:p>
             <w:pPr>
               <w:pStyle w:val="Compact"/>
+              <w:jc w:val="right"/>
             </w:pPr>
             <w:r>
               <w:rPr>
@@ -137,6 +1090,7 @@
           <w:p>
             <w:pPr>
               <w:pStyle w:val="Compact"/>
+              <w:jc w:val="right"/>
             </w:pPr>
             <w:r>
               <w:rPr>
@@ -152,6 +1106,7 @@
           <w:p>
             <w:pPr>
               <w:pStyle w:val="Compact"/>
+              <w:jc w:val="right"/>
             </w:pPr>
             <w:r>
               <w:rPr>
@@ -167,6 +1122,7 @@
           <w:p>
             <w:pPr>
               <w:pStyle w:val="Compact"/>
+              <w:jc w:val="right"/>
             </w:pPr>
             <w:r>
               <w:rPr>
@@ -199,6 +1155,7 @@
           <w:p>
             <w:pPr>
               <w:pStyle w:val="Compact"/>
+              <w:jc w:val="right"/>
             </w:pPr>
             <w:r>
               <w:t xml:space="preserve">0.7201</w:t>
@@ -210,6 +1167,7 @@
           <w:p>
             <w:pPr>
               <w:pStyle w:val="Compact"/>
+              <w:jc w:val="right"/>
             </w:pPr>
             <w:r>
               <w:t xml:space="preserve">0.6100</w:t>
@@ -221,6 +1179,7 @@
           <w:p>
             <w:pPr>
               <w:pStyle w:val="Compact"/>
+              <w:jc w:val="right"/>
             </w:pPr>
             <w:r>
               <w:t xml:space="preserve">0.5961</w:t>
@@ -232,6 +1191,7 @@
           <w:p>
             <w:pPr>
               <w:pStyle w:val="Compact"/>
+              <w:jc w:val="right"/>
             </w:pPr>
             <w:r>
               <w:t xml:space="preserve">0.6485</w:t>
@@ -260,6 +1220,7 @@
           <w:p>
             <w:pPr>
               <w:pStyle w:val="Compact"/>
+              <w:jc w:val="right"/>
             </w:pPr>
             <w:r>
               <w:t xml:space="preserve">0.7196</w:t>
@@ -271,6 +1232,7 @@
           <w:p>
             <w:pPr>
               <w:pStyle w:val="Compact"/>
+              <w:jc w:val="right"/>
             </w:pPr>
             <w:r>
               <w:t xml:space="preserve">0.6067</w:t>
@@ -282,6 +1244,7 @@
           <w:p>
             <w:pPr>
               <w:pStyle w:val="Compact"/>
+              <w:jc w:val="right"/>
             </w:pPr>
             <w:r>
               <w:t xml:space="preserve">0.6030</w:t>
@@ -293,6 +1256,7 @@
           <w:p>
             <w:pPr>
               <w:pStyle w:val="Compact"/>
+              <w:jc w:val="right"/>
             </w:pPr>
             <w:r>
               <w:t xml:space="preserve">0.6363</w:t>
@@ -321,6 +1285,7 @@
           <w:p>
             <w:pPr>
               <w:pStyle w:val="Compact"/>
+              <w:jc w:val="right"/>
             </w:pPr>
             <w:r>
               <w:t xml:space="preserve">0.7113</w:t>
@@ -332,6 +1297,7 @@
           <w:p>
             <w:pPr>
               <w:pStyle w:val="Compact"/>
+              <w:jc w:val="right"/>
             </w:pPr>
             <w:r>
               <w:t xml:space="preserve">0.6026</w:t>
@@ -343,6 +1309,7 @@
           <w:p>
             <w:pPr>
               <w:pStyle w:val="Compact"/>
+              <w:jc w:val="right"/>
             </w:pPr>
             <w:r>
               <w:t xml:space="preserve">0.5895</w:t>
@@ -354,6 +1321,7 @@
           <w:p>
             <w:pPr>
               <w:pStyle w:val="Compact"/>
+              <w:jc w:val="right"/>
             </w:pPr>
             <w:r>
               <w:t xml:space="preserve">0.6417</w:t>
@@ -382,6 +1350,7 @@
           <w:p>
             <w:pPr>
               <w:pStyle w:val="Compact"/>
+              <w:jc w:val="right"/>
             </w:pPr>
             <w:r>
               <w:t xml:space="preserve">0.7113</w:t>
@@ -393,6 +1362,7 @@
           <w:p>
             <w:pPr>
               <w:pStyle w:val="Compact"/>
+              <w:jc w:val="right"/>
             </w:pPr>
             <w:r>
               <w:t xml:space="preserve">0.6001</w:t>
@@ -404,6 +1374,7 @@
           <w:p>
             <w:pPr>
               <w:pStyle w:val="Compact"/>
+              <w:jc w:val="right"/>
             </w:pPr>
             <w:r>
               <w:t xml:space="preserve">0.5894</w:t>
@@ -415,6 +1386,7 @@
           <w:p>
             <w:pPr>
               <w:pStyle w:val="Compact"/>
+              <w:jc w:val="right"/>
             </w:pPr>
             <w:r>
               <w:t xml:space="preserve">0.6298</w:t>
@@ -443,6 +1415,7 @@
           <w:p>
             <w:pPr>
               <w:pStyle w:val="Compact"/>
+              <w:jc w:val="right"/>
             </w:pPr>
             <w:r>
               <w:t xml:space="preserve">0.7102</w:t>
@@ -454,6 +1427,7 @@
           <w:p>
             <w:pPr>
               <w:pStyle w:val="Compact"/>
+              <w:jc w:val="right"/>
             </w:pPr>
             <w:r>
               <w:t xml:space="preserve">0.5984</w:t>
@@ -465,6 +1439,7 @@
           <w:p>
             <w:pPr>
               <w:pStyle w:val="Compact"/>
+              <w:jc w:val="right"/>
             </w:pPr>
             <w:r>
               <w:t xml:space="preserve">0.5880</w:t>
@@ -476,6 +1451,7 @@
           <w:p>
             <w:pPr>
               <w:pStyle w:val="Compact"/>
+              <w:jc w:val="right"/>
             </w:pPr>
             <w:r>
               <w:t xml:space="preserve">0.6339</w:t>
@@ -504,6 +1480,7 @@
           <w:p>
             <w:pPr>
               <w:pStyle w:val="Compact"/>
+              <w:jc w:val="right"/>
             </w:pPr>
             <w:r>
               <w:t xml:space="preserve">0.7030</w:t>
@@ -515,6 +1492,7 @@
           <w:p>
             <w:pPr>
               <w:pStyle w:val="Compact"/>
+              <w:jc w:val="right"/>
             </w:pPr>
             <w:r>
               <w:t xml:space="preserve">0.5972</w:t>
@@ -526,6 +1504,7 @@
           <w:p>
             <w:pPr>
               <w:pStyle w:val="Compact"/>
+              <w:jc w:val="right"/>
             </w:pPr>
             <w:r>
               <w:t xml:space="preserve">0.5827</w:t>
@@ -537,6 +1516,7 @@
           <w:p>
             <w:pPr>
               <w:pStyle w:val="Compact"/>
+              <w:jc w:val="right"/>
             </w:pPr>
             <w:r>
               <w:t xml:space="preserve">0.6381</w:t>
@@ -565,6 +1545,7 @@
           <w:p>
             <w:pPr>
               <w:pStyle w:val="Compact"/>
+              <w:jc w:val="right"/>
             </w:pPr>
             <w:r>
               <w:t xml:space="preserve">0.6980</w:t>
@@ -576,6 +1557,7 @@
           <w:p>
             <w:pPr>
               <w:pStyle w:val="Compact"/>
+              <w:jc w:val="right"/>
             </w:pPr>
             <w:r>
               <w:t xml:space="preserve">0.5871</w:t>
@@ -587,6 +1569,7 @@
           <w:p>
             <w:pPr>
               <w:pStyle w:val="Compact"/>
+              <w:jc w:val="right"/>
             </w:pPr>
             <w:r>
               <w:t xml:space="preserve">0.5813</w:t>
@@ -598,6 +1581,7 @@
           <w:p>
             <w:pPr>
               <w:pStyle w:val="Compact"/>
+              <w:jc w:val="right"/>
             </w:pPr>
             <w:r>
               <w:t xml:space="preserve">0.6167</w:t>
@@ -626,6 +1610,7 @@
           <w:p>
             <w:pPr>
               <w:pStyle w:val="Compact"/>
+              <w:jc w:val="right"/>
             </w:pPr>
             <w:r>
               <w:t xml:space="preserve">0.6858</w:t>
@@ -637,6 +1622,7 @@
           <w:p>
             <w:pPr>
               <w:pStyle w:val="Compact"/>
+              <w:jc w:val="right"/>
             </w:pPr>
             <w:r>
               <w:t xml:space="preserve">0.5790</w:t>
@@ -648,6 +1634,7 @@
           <w:p>
             <w:pPr>
               <w:pStyle w:val="Compact"/>
+              <w:jc w:val="right"/>
             </w:pPr>
             <w:r>
               <w:t xml:space="preserve">0.5687</w:t>
@@ -659,6 +1646,7 @@
           <w:p>
             <w:pPr>
               <w:pStyle w:val="Compact"/>
+              <w:jc w:val="right"/>
             </w:pPr>
             <w:r>
               <w:t xml:space="preserve">0.6174</w:t>
@@ -687,6 +1675,7 @@
           <w:p>
             <w:pPr>
               <w:pStyle w:val="Compact"/>
+              <w:jc w:val="right"/>
             </w:pPr>
             <w:r>
               <w:t xml:space="preserve">0.6825</w:t>
@@ -698,6 +1687,7 @@
           <w:p>
             <w:pPr>
               <w:pStyle w:val="Compact"/>
+              <w:jc w:val="right"/>
             </w:pPr>
             <w:r>
               <w:t xml:space="preserve">0.5762</w:t>
@@ -709,6 +1699,7 @@
           <w:p>
             <w:pPr>
               <w:pStyle w:val="Compact"/>
+              <w:jc w:val="right"/>
             </w:pPr>
             <w:r>
               <w:t xml:space="preserve">0.5652</w:t>
@@ -720,6 +1711,7 @@
           <w:p>
             <w:pPr>
               <w:pStyle w:val="Compact"/>
+              <w:jc w:val="right"/>
             </w:pPr>
             <w:r>
               <w:t xml:space="preserve">0.6150</w:t>
@@ -730,14 +1722,20 @@
     </w:tbl>
     <w:p>
       <w:pPr>
-        <w:pStyle w:val="BodyText"/>
-      </w:pPr>
-      <w:r>
-        <w:rPr>
-          <w:i/>
-          <w:iCs/>
-        </w:rPr>
-        <w:t xml:space="preserve">Note: All models were evaluated using Stratified 5-Fold Cross-Validation. The metrics presented represent the average performance across all five folds, ensuring a robust and statistically sound evaluation.</w:t>
+        <w:pStyle w:val="BlockText"/>
+      </w:pPr>
+      <w:r>
+        <w:rPr>
+          <w:b/>
+          <w:bCs/>
+        </w:rPr>
+        <w:t xml:space="preserve">Result:</w:t>
+      </w:r>
+      <w:r>
+        <w:t xml:space="preserve"> </w:t>
+      </w:r>
+      <w:r>
+        <w:t xml:space="preserve">VGG-16 achieves the highest Macro-F1 (0.6217) and recall (0.6725), tied with Swin Base on accuracy (0.7201).</w:t>
       </w:r>
     </w:p>
     <w:p>
@@ -747,29 +1745,88 @@
         </w:pict>
       </w:r>
     </w:p>
-    <w:bookmarkEnd w:id="9"/>
-    <w:bookmarkStart w:id="17" w:name="key-charts-and-takeaways"/>
+    <w:bookmarkEnd w:id="18"/>
+    <w:bookmarkEnd w:id="19"/>
+    <w:bookmarkStart w:id="48" w:name="key-charts-takeaways"/>
     <w:p>
       <w:pPr>
         <w:pStyle w:val="Heading2"/>
       </w:pPr>
       <w:r>
-        <w:t xml:space="preserve">Key Charts and Takeaways</w:t>
-      </w:r>
-    </w:p>
-    <w:bookmarkStart w:id="10" w:name="overall-performance"/>
+        <w:t xml:space="preserve">4. Key Charts &amp; Takeaways</w:t>
+      </w:r>
+    </w:p>
+    <w:p>
+      <w:pPr>
+        <w:pStyle w:val="FirstParagraph"/>
+      </w:pPr>
+      <w:r>
+        <w:t xml:space="preserve">This section presents the comparative visualizations generated from the out-of-fold predictions of all baseline models.</w:t>
+      </w:r>
+    </w:p>
+    <w:bookmarkStart w:id="23" w:name="overall-performance"/>
     <w:p>
       <w:pPr>
         <w:pStyle w:val="Heading3"/>
       </w:pPr>
       <w:r>
-        <w:t xml:space="preserve">1. Overall Performance</w:t>
-      </w:r>
-    </w:p>
-    <w:p>
-      <w:pPr>
-        <w:pStyle w:val="FirstParagraph"/>
-      </w:pPr>
+        <w:t xml:space="preserve">4.1 Overall Performance</w:t>
+      </w:r>
+    </w:p>
+    <w:p>
+      <w:pPr>
+        <w:pStyle w:val="CaptionedFigure"/>
+      </w:pPr>
+      <w:r>
+        <w:drawing>
+          <wp:inline>
+            <wp:extent cx="4859999" cy="2429999"/>
+            <wp:effectExtent b="0" l="0" r="0" t="0"/>
+            <wp:docPr descr="Grouped bar chart comparing accuracy, precision, recall, and Macro-F1 across all ten baselines." title="" id="21" name="Picture"/>
+            <a:graphic>
+              <a:graphicData uri="http://schemas.openxmlformats.org/drawingml/2006/picture">
+                <pic:pic>
+                  <pic:nvPicPr>
+                    <pic:cNvPr descr="results/results/paper_figures/1_cv_grouped_bar_metrics.png" id="22" name="Picture"/>
+                    <pic:cNvPicPr>
+                      <a:picLocks noChangeArrowheads="1" noChangeAspect="1"/>
+                    </pic:cNvPicPr>
+                  </pic:nvPicPr>
+                  <pic:blipFill>
+                    <a:blip r:embed="rId20"/>
+                    <a:stretch>
+                      <a:fillRect/>
+                    </a:stretch>
+                  </pic:blipFill>
+                  <pic:spPr bwMode="auto">
+                    <a:xfrm>
+                      <a:off x="0" y="0"/>
+                      <a:ext cx="4859999" cy="2429999"/>
+                    </a:xfrm>
+                    <a:prstGeom prst="rect">
+                      <a:avLst/>
+                    </a:prstGeom>
+                    <a:noFill/>
+                    <a:ln w="9525">
+                      <a:noFill/>
+                      <a:headEnd/>
+                      <a:tailEnd/>
+                    </a:ln>
+                  </pic:spPr>
+                </pic:pic>
+              </a:graphicData>
+            </a:graphic>
+          </wp:inline>
+        </w:drawing>
+      </w:r>
+    </w:p>
+    <w:p>
+      <w:pPr>
+        <w:pStyle w:val="ImageCaption"/>
+      </w:pPr>
+      <w:r>
+        <w:t xml:space="preserve">Grouped bar chart comparing accuracy, precision, recall, and Macro-F1 across all ten baselines.</w:t>
+      </w:r>
     </w:p>
     <w:p>
       <w:pPr>
@@ -786,23 +1843,73 @@
         <w:t xml:space="preserve"> </w:t>
       </w:r>
       <w:r>
-        <w:t xml:space="preserve">VGG-16 and Swin Base achieved the highest overall performance across the evaluated metrics, making them the strongest baseline models.</w:t>
-      </w:r>
-    </w:p>
-    <w:bookmarkEnd w:id="10"/>
-    <w:bookmarkStart w:id="11" w:name="balancing-rare-emotions"/>
+        <w:t xml:space="preserve">VGG-16 and Swin Base achieved the highest overall performance across the evaluated metrics, making them the strongest standard architectures.</w:t>
+      </w:r>
+    </w:p>
+    <w:bookmarkEnd w:id="23"/>
+    <w:bookmarkStart w:id="27" w:name="balancing-rare-emotions"/>
     <w:p>
       <w:pPr>
         <w:pStyle w:val="Heading3"/>
       </w:pPr>
       <w:r>
-        <w:t xml:space="preserve">2. Balancing Rare Emotions</w:t>
-      </w:r>
-    </w:p>
-    <w:p>
-      <w:pPr>
-        <w:pStyle w:val="FirstParagraph"/>
-      </w:pPr>
+        <w:t xml:space="preserve">4.2 Balancing Rare Emotions</w:t>
+      </w:r>
+    </w:p>
+    <w:p>
+      <w:pPr>
+        <w:pStyle w:val="CaptionedFigure"/>
+      </w:pPr>
+      <w:r>
+        <w:drawing>
+          <wp:inline>
+            <wp:extent cx="4859999" cy="2429999"/>
+            <wp:effectExtent b="0" l="0" r="0" t="0"/>
+            <wp:docPr descr="Macro-F1 comparison across models, highlighting robustness to class imbalance." title="" id="25" name="Picture"/>
+            <a:graphic>
+              <a:graphicData uri="http://schemas.openxmlformats.org/drawingml/2006/picture">
+                <pic:pic>
+                  <pic:nvPicPr>
+                    <pic:cNvPr descr="results/results/paper_figures/2_cv_f1_comparison.png" id="26" name="Picture"/>
+                    <pic:cNvPicPr>
+                      <a:picLocks noChangeArrowheads="1" noChangeAspect="1"/>
+                    </pic:cNvPicPr>
+                  </pic:nvPicPr>
+                  <pic:blipFill>
+                    <a:blip r:embed="rId24"/>
+                    <a:stretch>
+                      <a:fillRect/>
+                    </a:stretch>
+                  </pic:blipFill>
+                  <pic:spPr bwMode="auto">
+                    <a:xfrm>
+                      <a:off x="0" y="0"/>
+                      <a:ext cx="4859999" cy="2429999"/>
+                    </a:xfrm>
+                    <a:prstGeom prst="rect">
+                      <a:avLst/>
+                    </a:prstGeom>
+                    <a:noFill/>
+                    <a:ln w="9525">
+                      <a:noFill/>
+                      <a:headEnd/>
+                      <a:tailEnd/>
+                    </a:ln>
+                  </pic:spPr>
+                </pic:pic>
+              </a:graphicData>
+            </a:graphic>
+          </wp:inline>
+        </w:drawing>
+      </w:r>
+    </w:p>
+    <w:p>
+      <w:pPr>
+        <w:pStyle w:val="ImageCaption"/>
+      </w:pPr>
+      <w:r>
+        <w:t xml:space="preserve">Macro-F1 comparison across models, highlighting robustness to class imbalance.</w:t>
+      </w:r>
     </w:p>
     <w:p>
       <w:pPr>
@@ -819,23 +1926,73 @@
         <w:t xml:space="preserve"> </w:t>
       </w:r>
       <w:r>
-        <w:t xml:space="preserve">The Macro-F1 score indicates how effectively a model manages class imbalance rather than defaulting to majority classes. VGG-16 demonstrates the most consistent ability to balance performance across all emotion categories.</w:t>
-      </w:r>
-    </w:p>
-    <w:bookmarkEnd w:id="11"/>
-    <w:bookmarkStart w:id="12" w:name="roc-curve-top-5-models"/>
+        <w:t xml:space="preserve">The Macro-F1 score indicates how effectively a model manages class imbalance rather than defaulting to majority classes. CNNs currently set the benchmark for maintaining precision on minority classes.</w:t>
+      </w:r>
+    </w:p>
+    <w:bookmarkEnd w:id="27"/>
+    <w:bookmarkStart w:id="31" w:name="roc-curve-top-models"/>
     <w:p>
       <w:pPr>
         <w:pStyle w:val="Heading3"/>
       </w:pPr>
       <w:r>
-        <w:t xml:space="preserve">3. ROC Curve (Top 5 Models)</w:t>
-      </w:r>
-    </w:p>
-    <w:p>
-      <w:pPr>
-        <w:pStyle w:val="FirstParagraph"/>
-      </w:pPr>
+        <w:t xml:space="preserve">4.3 ROC Curve (Top Models)</w:t>
+      </w:r>
+    </w:p>
+    <w:p>
+      <w:pPr>
+        <w:pStyle w:val="CaptionedFigure"/>
+      </w:pPr>
+      <w:r>
+        <w:drawing>
+          <wp:inline>
+            <wp:extent cx="4859999" cy="3887999"/>
+            <wp:effectExtent b="0" l="0" r="0" t="0"/>
+            <wp:docPr descr="Receiver-operating-characteristic (ROC) curves for the top-performing models." title="" id="29" name="Picture"/>
+            <a:graphic>
+              <a:graphicData uri="http://schemas.openxmlformats.org/drawingml/2006/picture">
+                <pic:pic>
+                  <pic:nvPicPr>
+                    <pic:cNvPr descr="results/results/paper_figures/3_roc_curve.png" id="30" name="Picture"/>
+                    <pic:cNvPicPr>
+                      <a:picLocks noChangeArrowheads="1" noChangeAspect="1"/>
+                    </pic:cNvPicPr>
+                  </pic:nvPicPr>
+                  <pic:blipFill>
+                    <a:blip r:embed="rId28"/>
+                    <a:stretch>
+                      <a:fillRect/>
+                    </a:stretch>
+                  </pic:blipFill>
+                  <pic:spPr bwMode="auto">
+                    <a:xfrm>
+                      <a:off x="0" y="0"/>
+                      <a:ext cx="4859999" cy="3887999"/>
+                    </a:xfrm>
+                    <a:prstGeom prst="rect">
+                      <a:avLst/>
+                    </a:prstGeom>
+                    <a:noFill/>
+                    <a:ln w="9525">
+                      <a:noFill/>
+                      <a:headEnd/>
+                      <a:tailEnd/>
+                    </a:ln>
+                  </pic:spPr>
+                </pic:pic>
+              </a:graphicData>
+            </a:graphic>
+          </wp:inline>
+        </w:drawing>
+      </w:r>
+    </w:p>
+    <w:p>
+      <w:pPr>
+        <w:pStyle w:val="ImageCaption"/>
+      </w:pPr>
+      <w:r>
+        <w:t xml:space="preserve">Receiver-operating-characteristic (ROC) curves for the top-performing models.</w:t>
+      </w:r>
     </w:p>
     <w:p>
       <w:pPr>
@@ -852,23 +2009,73 @@
         <w:t xml:space="preserve"> </w:t>
       </w:r>
       <w:r>
-        <w:t xml:space="preserve">The top 5 models achieve high Area Under the Curve (AUC) scores, demonstrating that the raw, unaugmented image data contains sufficient discriminatory features for accurate classification.</w:t>
-      </w:r>
-    </w:p>
-    <w:bookmarkEnd w:id="12"/>
-    <w:bookmarkStart w:id="13" w:name="precision-vs-recall"/>
+        <w:t xml:space="preserve">The leading models achieve high Area Under the Curve (AUC) scores, demonstrating that the raw image data contains sufficient discriminatory features for accurate classification.</w:t>
+      </w:r>
+    </w:p>
+    <w:bookmarkEnd w:id="31"/>
+    <w:bookmarkStart w:id="35" w:name="precision-vs.-recall"/>
     <w:p>
       <w:pPr>
         <w:pStyle w:val="Heading3"/>
       </w:pPr>
       <w:r>
-        <w:t xml:space="preserve">4. Precision vs Recall</w:t>
-      </w:r>
-    </w:p>
-    <w:p>
-      <w:pPr>
-        <w:pStyle w:val="FirstParagraph"/>
-      </w:pPr>
+        <w:t xml:space="preserve">4.4 Precision vs. Recall</w:t>
+      </w:r>
+    </w:p>
+    <w:p>
+      <w:pPr>
+        <w:pStyle w:val="CaptionedFigure"/>
+      </w:pPr>
+      <w:r>
+        <w:drawing>
+          <wp:inline>
+            <wp:extent cx="4859999" cy="3887999"/>
+            <wp:effectExtent b="0" l="0" r="0" t="0"/>
+            <wp:docPr descr="Precision-recall curves illustrating the trade-off for minority classes." title="" id="33" name="Picture"/>
+            <a:graphic>
+              <a:graphicData uri="http://schemas.openxmlformats.org/drawingml/2006/picture">
+                <pic:pic>
+                  <pic:nvPicPr>
+                    <pic:cNvPr descr="results/results/paper_figures/4_pr_curve.png" id="34" name="Picture"/>
+                    <pic:cNvPicPr>
+                      <a:picLocks noChangeArrowheads="1" noChangeAspect="1"/>
+                    </pic:cNvPicPr>
+                  </pic:nvPicPr>
+                  <pic:blipFill>
+                    <a:blip r:embed="rId32"/>
+                    <a:stretch>
+                      <a:fillRect/>
+                    </a:stretch>
+                  </pic:blipFill>
+                  <pic:spPr bwMode="auto">
+                    <a:xfrm>
+                      <a:off x="0" y="0"/>
+                      <a:ext cx="4859999" cy="3887999"/>
+                    </a:xfrm>
+                    <a:prstGeom prst="rect">
+                      <a:avLst/>
+                    </a:prstGeom>
+                    <a:noFill/>
+                    <a:ln w="9525">
+                      <a:noFill/>
+                      <a:headEnd/>
+                      <a:tailEnd/>
+                    </a:ln>
+                  </pic:spPr>
+                </pic:pic>
+              </a:graphicData>
+            </a:graphic>
+          </wp:inline>
+        </w:drawing>
+      </w:r>
+    </w:p>
+    <w:p>
+      <w:pPr>
+        <w:pStyle w:val="ImageCaption"/>
+      </w:pPr>
+      <w:r>
+        <w:t xml:space="preserve">Precision-recall curves illustrating the trade-off for minority classes.</w:t>
+      </w:r>
     </w:p>
     <w:p>
       <w:pPr>
@@ -885,23 +2092,102 @@
         <w:t xml:space="preserve"> </w:t>
       </w:r>
       <w:r>
-        <w:t xml:space="preserve">The tight clustering among the leading models indicates a strong capacity to maintain high precision without sacrificing recall, which is essential for handling minority classes.</w:t>
-      </w:r>
-    </w:p>
-    <w:bookmarkEnd w:id="13"/>
-    <w:bookmarkStart w:id="14" w:name="radar-chart"/>
+        <w:t xml:space="preserve">The tight clustering among the leading models indicates a strong capacity to maintain high precision without sacrificing recall, which is essential for handling minority classes like</w:t>
+      </w:r>
+      <w:r>
+        <w:t xml:space="preserve"> </w:t>
+      </w:r>
+      <w:r>
+        <w:rPr>
+          <w:i/>
+          <w:iCs/>
+        </w:rPr>
+        <w:t xml:space="preserve">fear</w:t>
+      </w:r>
+      <w:r>
+        <w:t xml:space="preserve"> </w:t>
+      </w:r>
+      <w:r>
+        <w:t xml:space="preserve">and</w:t>
+      </w:r>
+      <w:r>
+        <w:t xml:space="preserve"> </w:t>
+      </w:r>
+      <w:r>
+        <w:rPr>
+          <w:i/>
+          <w:iCs/>
+        </w:rPr>
+        <w:t xml:space="preserve">surprise</w:t>
+      </w:r>
+      <w:r>
+        <w:t xml:space="preserve">.</w:t>
+      </w:r>
+    </w:p>
+    <w:bookmarkEnd w:id="35"/>
+    <w:bookmarkStart w:id="39" w:name="radar-chart"/>
     <w:p>
       <w:pPr>
         <w:pStyle w:val="Heading3"/>
       </w:pPr>
       <w:r>
-        <w:t xml:space="preserve">5. Radar Chart</w:t>
-      </w:r>
-    </w:p>
-    <w:p>
-      <w:pPr>
-        <w:pStyle w:val="FirstParagraph"/>
-      </w:pPr>
+        <w:t xml:space="preserve">4.5 Radar Chart</w:t>
+      </w:r>
+    </w:p>
+    <w:p>
+      <w:pPr>
+        <w:pStyle w:val="CaptionedFigure"/>
+      </w:pPr>
+      <w:r>
+        <w:drawing>
+          <wp:inline>
+            <wp:extent cx="4859999" cy="4249625"/>
+            <wp:effectExtent b="0" l="0" r="0" t="0"/>
+            <wp:docPr descr="Multi-metric radar footprint of the baseline models." title="" id="37" name="Picture"/>
+            <a:graphic>
+              <a:graphicData uri="http://schemas.openxmlformats.org/drawingml/2006/picture">
+                <pic:pic>
+                  <pic:nvPicPr>
+                    <pic:cNvPr descr="results/results/paper_figures/5_radar_chart.png" id="38" name="Picture"/>
+                    <pic:cNvPicPr>
+                      <a:picLocks noChangeArrowheads="1" noChangeAspect="1"/>
+                    </pic:cNvPicPr>
+                  </pic:nvPicPr>
+                  <pic:blipFill>
+                    <a:blip r:embed="rId36"/>
+                    <a:stretch>
+                      <a:fillRect/>
+                    </a:stretch>
+                  </pic:blipFill>
+                  <pic:spPr bwMode="auto">
+                    <a:xfrm>
+                      <a:off x="0" y="0"/>
+                      <a:ext cx="4859999" cy="4249625"/>
+                    </a:xfrm>
+                    <a:prstGeom prst="rect">
+                      <a:avLst/>
+                    </a:prstGeom>
+                    <a:noFill/>
+                    <a:ln w="9525">
+                      <a:noFill/>
+                      <a:headEnd/>
+                      <a:tailEnd/>
+                    </a:ln>
+                  </pic:spPr>
+                </pic:pic>
+              </a:graphicData>
+            </a:graphic>
+          </wp:inline>
+        </w:drawing>
+      </w:r>
+    </w:p>
+    <w:p>
+      <w:pPr>
+        <w:pStyle w:val="ImageCaption"/>
+      </w:pPr>
+      <w:r>
+        <w:t xml:space="preserve">Multi-metric radar footprint of the baseline models.</w:t>
+      </w:r>
     </w:p>
     <w:p>
       <w:pPr>
@@ -918,23 +2204,73 @@
         <w:t xml:space="preserve"> </w:t>
       </w:r>
       <w:r>
-        <w:t xml:space="preserve">The multi-metric footprint visually confirms that VGG-16 exhibits well-rounded performance, without isolated failures in any single evaluation metric.</w:t>
-      </w:r>
-    </w:p>
-    <w:bookmarkEnd w:id="14"/>
-    <w:bookmarkStart w:id="15" w:name="where-the-best-model-struggles"/>
+        <w:t xml:space="preserve">The multi-metric footprint visually confirms the well-rounded performance of the top baseline models, establishing the target performance threshold for our future hybrid architecture.</w:t>
+      </w:r>
+    </w:p>
+    <w:bookmarkEnd w:id="39"/>
+    <w:bookmarkStart w:id="43" w:name="where-the-best-baseline-struggles"/>
     <w:p>
       <w:pPr>
         <w:pStyle w:val="Heading3"/>
       </w:pPr>
       <w:r>
-        <w:t xml:space="preserve">6. Where the Best Model Struggles</w:t>
-      </w:r>
-    </w:p>
-    <w:p>
-      <w:pPr>
-        <w:pStyle w:val="FirstParagraph"/>
-      </w:pPr>
+        <w:t xml:space="preserve">4.6 Where the Best Baseline Struggles</w:t>
+      </w:r>
+    </w:p>
+    <w:p>
+      <w:pPr>
+        <w:pStyle w:val="CaptionedFigure"/>
+      </w:pPr>
+      <w:r>
+        <w:drawing>
+          <wp:inline>
+            <wp:extent cx="4859999" cy="3887999"/>
+            <wp:effectExtent b="0" l="0" r="0" t="0"/>
+            <wp:docPr descr="Out-of-fold confusion matrix for the best baseline (VGG-16)." title="" id="41" name="Picture"/>
+            <a:graphic>
+              <a:graphicData uri="http://schemas.openxmlformats.org/drawingml/2006/picture">
+                <pic:pic>
+                  <pic:nvPicPr>
+                    <pic:cNvPr descr="results/results/paper_figures/6_best_model_oof_cm.png" id="42" name="Picture"/>
+                    <pic:cNvPicPr>
+                      <a:picLocks noChangeArrowheads="1" noChangeAspect="1"/>
+                    </pic:cNvPicPr>
+                  </pic:nvPicPr>
+                  <pic:blipFill>
+                    <a:blip r:embed="rId40"/>
+                    <a:stretch>
+                      <a:fillRect/>
+                    </a:stretch>
+                  </pic:blipFill>
+                  <pic:spPr bwMode="auto">
+                    <a:xfrm>
+                      <a:off x="0" y="0"/>
+                      <a:ext cx="4859999" cy="3887999"/>
+                    </a:xfrm>
+                    <a:prstGeom prst="rect">
+                      <a:avLst/>
+                    </a:prstGeom>
+                    <a:noFill/>
+                    <a:ln w="9525">
+                      <a:noFill/>
+                      <a:headEnd/>
+                      <a:tailEnd/>
+                    </a:ln>
+                  </pic:spPr>
+                </pic:pic>
+              </a:graphicData>
+            </a:graphic>
+          </wp:inline>
+        </w:drawing>
+      </w:r>
+    </w:p>
+    <w:p>
+      <w:pPr>
+        <w:pStyle w:val="ImageCaption"/>
+      </w:pPr>
+      <w:r>
+        <w:t xml:space="preserve">Out-of-fold confusion matrix for the best baseline (VGG-16).</w:t>
+      </w:r>
     </w:p>
     <w:p>
       <w:pPr>
@@ -951,13 +2287,17 @@
         <w:t xml:space="preserve"> </w:t>
       </w:r>
       <w:r>
-        <w:t xml:space="preserve">The confusion matrix for VGG-16 reveals that the model still occasionally misclassifies</w:t>
-      </w:r>
-      <w:r>
-        <w:t xml:space="preserve"> </w:t>
-      </w:r>
-      <w:r>
-        <w:t xml:space="preserve">“Fear”</w:t>
+        <w:t xml:space="preserve">The confusion matrix for VGG-16 reveals that the model occasionally misclassifies</w:t>
+      </w:r>
+      <w:r>
+        <w:t xml:space="preserve"> </w:t>
+      </w:r>
+      <w:r>
+        <w:rPr>
+          <w:i/>
+          <w:iCs/>
+        </w:rPr>
+        <w:t xml:space="preserve">fear</w:t>
       </w:r>
       <w:r>
         <w:t xml:space="preserve"> </w:t>
@@ -969,29 +2309,80 @@
         <w:t xml:space="preserve"> </w:t>
       </w:r>
       <w:r>
-        <w:t xml:space="preserve">“Surprise.”</w:t>
-      </w:r>
-      <w:r>
-        <w:t xml:space="preserve"> </w:t>
-      </w:r>
-      <w:r>
-        <w:t xml:space="preserve">This is an expected limitation due to the relative scarcity of training samples for these specific expressions.</w:t>
-      </w:r>
-    </w:p>
-    <w:bookmarkEnd w:id="15"/>
-    <w:bookmarkStart w:id="16" w:name="feature-correlation-analysis"/>
+        <w:rPr>
+          <w:i/>
+          <w:iCs/>
+        </w:rPr>
+        <w:t xml:space="preserve">surprise</w:t>
+      </w:r>
+      <w:r>
+        <w:t xml:space="preserve">. Addressing these specific misclassifications will be a primary goal of our proposed hybrid model.</w:t>
+      </w:r>
+    </w:p>
+    <w:bookmarkEnd w:id="43"/>
+    <w:bookmarkStart w:id="47" w:name="feature-correlation-analysis"/>
     <w:p>
       <w:pPr>
         <w:pStyle w:val="Heading3"/>
       </w:pPr>
       <w:r>
-        <w:t xml:space="preserve">7. Feature Correlation Analysis</w:t>
-      </w:r>
-    </w:p>
-    <w:p>
-      <w:pPr>
-        <w:pStyle w:val="FirstParagraph"/>
-      </w:pPr>
+        <w:t xml:space="preserve">4.7 Feature Correlation Analysis</w:t>
+      </w:r>
+    </w:p>
+    <w:p>
+      <w:pPr>
+        <w:pStyle w:val="CaptionedFigure"/>
+      </w:pPr>
+      <w:r>
+        <w:drawing>
+          <wp:inline>
+            <wp:extent cx="4859999" cy="4049999"/>
+            <wp:effectExtent b="0" l="0" r="0" t="0"/>
+            <wp:docPr descr="Correlation heatmap between model predictions." title="" id="45" name="Picture"/>
+            <a:graphic>
+              <a:graphicData uri="http://schemas.openxmlformats.org/drawingml/2006/picture">
+                <pic:pic>
+                  <pic:nvPicPr>
+                    <pic:cNvPr descr="results/results/paper_figures/7_model_correlation_heatmap.png" id="46" name="Picture"/>
+                    <pic:cNvPicPr>
+                      <a:picLocks noChangeArrowheads="1" noChangeAspect="1"/>
+                    </pic:cNvPicPr>
+                  </pic:nvPicPr>
+                  <pic:blipFill>
+                    <a:blip r:embed="rId44"/>
+                    <a:stretch>
+                      <a:fillRect/>
+                    </a:stretch>
+                  </pic:blipFill>
+                  <pic:spPr bwMode="auto">
+                    <a:xfrm>
+                      <a:off x="0" y="0"/>
+                      <a:ext cx="4859999" cy="4049999"/>
+                    </a:xfrm>
+                    <a:prstGeom prst="rect">
+                      <a:avLst/>
+                    </a:prstGeom>
+                    <a:noFill/>
+                    <a:ln w="9525">
+                      <a:noFill/>
+                      <a:headEnd/>
+                      <a:tailEnd/>
+                    </a:ln>
+                  </pic:spPr>
+                </pic:pic>
+              </a:graphicData>
+            </a:graphic>
+          </wp:inline>
+        </w:drawing>
+      </w:r>
+    </w:p>
+    <w:p>
+      <w:pPr>
+        <w:pStyle w:val="ImageCaption"/>
+      </w:pPr>
+      <w:r>
+        <w:t xml:space="preserve">Correlation heatmap between model predictions.</w:t>
+      </w:r>
     </w:p>
     <w:p>
       <w:pPr>
@@ -1008,7 +2399,7 @@
         <w:t xml:space="preserve"> </w:t>
       </w:r>
       <w:r>
-        <w:t xml:space="preserve">The correlation heatmap indicates that CNN- and Transformer-based models capture different aspects of facial features. This observation may help guide the design of an improved architecture in the next phase of the research.</w:t>
+        <w:t xml:space="preserve">The correlation heatmap indicates that CNN- and Transformer-based models capture different aspects of facial features. This complementary observation directly motivates our plan to design a hybrid CNN-Transformer architecture in the next phase of the research.</w:t>
       </w:r>
     </w:p>
     <w:p>
@@ -1018,15 +2409,15 @@
         </w:pict>
       </w:r>
     </w:p>
-    <w:bookmarkEnd w:id="16"/>
-    <w:bookmarkEnd w:id="17"/>
-    <w:bookmarkStart w:id="18" w:name="methodology-overview"/>
+    <w:bookmarkEnd w:id="47"/>
+    <w:bookmarkEnd w:id="48"/>
+    <w:bookmarkStart w:id="49" w:name="kaggle-training-implementation"/>
     <w:p>
       <w:pPr>
         <w:pStyle w:val="Heading2"/>
       </w:pPr>
       <w:r>
-        <w:t xml:space="preserve">Methodology Overview</w:t>
+        <w:t xml:space="preserve">5. Kaggle Training Implementation</w:t>
       </w:r>
     </w:p>
     <w:p>
@@ -1034,51 +2425,245 @@
         <w:pStyle w:val="FirstParagraph"/>
       </w:pPr>
       <w:r>
-        <w:t xml:space="preserve">To ensure the evaluation was fair and representative of real-world generalization:</w:t>
-      </w:r>
-      <w:r>
-        <w:t xml:space="preserve"> </w:t>
-      </w:r>
-      <w:r>
-        <w:t xml:space="preserve">1.</w:t>
-      </w:r>
-      <w:r>
-        <w:t xml:space="preserve"> </w:t>
-      </w:r>
+        <w:t xml:space="preserve">The baseline benchmarking was executed entirely on Kaggle GPU instances using the standalone script</w:t>
+      </w:r>
+      <w:r>
+        <w:t xml:space="preserve"> </w:t>
+      </w:r>
+      <w:r>
+        <w:rPr>
+          <w:rStyle w:val="VerbatimChar"/>
+        </w:rPr>
+        <w:t xml:space="preserve">kaggle/run_all_models.py</w:t>
+      </w:r>
+      <w:r>
+        <w:t xml:space="preserve">. The training process was designed specifically to handle the small scale and imbalance of our ASD dataset while mitigating Kaggle session timeouts.</w:t>
+      </w:r>
+    </w:p>
+    <w:p>
+      <w:pPr>
+        <w:pStyle w:val="Compact"/>
+        <w:numPr>
+          <w:ilvl w:val="0"/>
+          <w:numId w:val="1002"/>
+        </w:numPr>
+      </w:pPr>
       <w:r>
         <w:rPr>
           <w:b/>
           <w:bCs/>
         </w:rPr>
-        <w:t xml:space="preserve">Stratified 5-Fold Cross-Validation:</w:t>
-      </w:r>
-      <w:r>
-        <w:t xml:space="preserve"> </w:t>
-      </w:r>
-      <w:r>
-        <w:t xml:space="preserve">Instead of using a fixed test split, the 1,808 images were merged and divided into 5 folds. The models trained on 4 parts and tested on the remaining 1 part, repeating 5 times. This ensures every image is tested exactly once, producing highly reliable metrics.</w:t>
-      </w:r>
-      <w:r>
-        <w:t xml:space="preserve"> </w:t>
-      </w:r>
-      <w:r>
-        <w:t xml:space="preserve">2.</w:t>
-      </w:r>
-      <w:r>
-        <w:t xml:space="preserve"> </w:t>
-      </w:r>
+        <w:t xml:space="preserve">Stratified 5-Fold CV:</w:t>
+      </w:r>
+      <w:r>
+        <w:t xml:space="preserve"> </w:t>
+      </w:r>
+      <w:r>
+        <w:t xml:space="preserve">All models were evaluated using Stratified 5-Fold Cross-Validation on the raw images. This ensures every image is predicted exactly once out-of-fold (OOF), making metrics for rare classes (like</w:t>
+      </w:r>
+      <w:r>
+        <w:t xml:space="preserve"> </w:t>
+      </w:r>
+      <w:r>
+        <w:rPr>
+          <w:i/>
+          <w:iCs/>
+        </w:rPr>
+        <w:t xml:space="preserve">fear</w:t>
+      </w:r>
+      <w:r>
+        <w:t xml:space="preserve">) statistically defensible.</w:t>
+      </w:r>
+    </w:p>
+    <w:p>
+      <w:pPr>
+        <w:pStyle w:val="Compact"/>
+        <w:numPr>
+          <w:ilvl w:val="0"/>
+          <w:numId w:val="1002"/>
+        </w:numPr>
+      </w:pPr>
       <w:r>
         <w:rPr>
           <w:b/>
           <w:bCs/>
         </w:rPr>
+        <w:t xml:space="preserve">Differential Learning Rates:</w:t>
+      </w:r>
+      <w:r>
+        <w:t xml:space="preserve"> </w:t>
+      </w:r>
+      <w:r>
+        <w:t xml:space="preserve">To prevent destabilizing pretrained weights, we applied a differential learning rate (the backbone uses</w:t>
+      </w:r>
+      <w:r>
+        <w:t xml:space="preserve"> </w:t>
+      </w:r>
+      <w:r>
+        <w:rPr>
+          <w:rStyle w:val="VerbatimChar"/>
+        </w:rPr>
+        <w:t xml:space="preserve">lr * 0.1</w:t>
+      </w:r>
+      <w:r>
+        <w:t xml:space="preserve">, while the head uses full</w:t>
+      </w:r>
+      <w:r>
+        <w:t xml:space="preserve"> </w:t>
+      </w:r>
+      <w:r>
+        <w:rPr>
+          <w:rStyle w:val="VerbatimChar"/>
+        </w:rPr>
+        <w:t xml:space="preserve">lr</w:t>
+      </w:r>
+      <w:r>
+        <w:t xml:space="preserve">). Transformers were trained conservatively (</w:t>
+      </w:r>
+      <w:r>
+        <w:rPr>
+          <w:rStyle w:val="VerbatimChar"/>
+        </w:rPr>
+        <w:t xml:space="preserve">lr=1e-4</w:t>
+      </w:r>
+      <w:r>
+        <w:t xml:space="preserve"> </w:t>
+      </w:r>
+      <w:r>
+        <w:t xml:space="preserve">with Label-Smoothed Cross-Entropy), while standard CNNs were trained more aggressively (</w:t>
+      </w:r>
+      <w:r>
+        <w:rPr>
+          <w:rStyle w:val="VerbatimChar"/>
+        </w:rPr>
+        <w:t xml:space="preserve">lr=1e-3</w:t>
+      </w:r>
+      <w:r>
+        <w:t xml:space="preserve"> </w:t>
+      </w:r>
+      <w:r>
+        <w:t xml:space="preserve">with Focal Loss).</w:t>
+      </w:r>
+    </w:p>
+    <w:p>
+      <w:pPr>
+        <w:pStyle w:val="Compact"/>
+        <w:numPr>
+          <w:ilvl w:val="0"/>
+          <w:numId w:val="1002"/>
+        </w:numPr>
+      </w:pPr>
+      <w:r>
+        <w:rPr>
+          <w:b/>
+          <w:bCs/>
+        </w:rPr>
         <w:t xml:space="preserve">Handling Class Imbalance:</w:t>
       </w:r>
       <w:r>
         <w:t xml:space="preserve"> </w:t>
       </w:r>
       <w:r>
-        <w:t xml:space="preserve">During training, minority classes were sampled more frequently so that the model learned all emotion classes more effectively.</w:t>
+        <w:t xml:space="preserve">To avoid over-regularizing small models via loss weighting, the severe class imbalance was handled strictly via a</w:t>
+      </w:r>
+      <w:r>
+        <w:t xml:space="preserve"> </w:t>
+      </w:r>
+      <w:r>
+        <w:rPr>
+          <w:rStyle w:val="VerbatimChar"/>
+        </w:rPr>
+        <w:t xml:space="preserve">WeightedRandomSampler</w:t>
+      </w:r>
+      <w:r>
+        <w:t xml:space="preserve"> </w:t>
+      </w:r>
+      <w:r>
+        <w:t xml:space="preserve">at the DataLoader level.</w:t>
+      </w:r>
+    </w:p>
+    <w:p>
+      <w:pPr>
+        <w:pStyle w:val="Compact"/>
+        <w:numPr>
+          <w:ilvl w:val="0"/>
+          <w:numId w:val="1002"/>
+        </w:numPr>
+      </w:pPr>
+      <w:r>
+        <w:rPr>
+          <w:b/>
+          <w:bCs/>
+        </w:rPr>
+        <w:t xml:space="preserve">Generalization (EMA &amp; AMP):</w:t>
+      </w:r>
+      <w:r>
+        <w:t xml:space="preserve"> </w:t>
+      </w:r>
+      <w:r>
+        <w:t xml:space="preserve">Mixed-precision training (AMP) accelerated execution on the GPU, while an Exponential Moving Average (EMA) of model weights was maintained to boost final generalization.</w:t>
+      </w:r>
+    </w:p>
+    <w:p>
+      <w:pPr>
+        <w:pStyle w:val="Compact"/>
+        <w:numPr>
+          <w:ilvl w:val="0"/>
+          <w:numId w:val="1002"/>
+        </w:numPr>
+      </w:pPr>
+      <w:r>
+        <w:rPr>
+          <w:b/>
+          <w:bCs/>
+        </w:rPr>
+        <w:t xml:space="preserve">Timeout-Resilient Execution:</w:t>
+      </w:r>
+      <w:r>
+        <w:t xml:space="preserve"> </w:t>
+      </w:r>
+      <w:r>
+        <w:t xml:space="preserve">Because Kaggle sessions often time out during long sweeps, the script is inherently resumable. It incrementally persists OOF predictions (</w:t>
+      </w:r>
+      <w:r>
+        <w:rPr>
+          <w:rStyle w:val="VerbatimChar"/>
+        </w:rPr>
+        <w:t xml:space="preserve">.npy</w:t>
+      </w:r>
+      <w:r>
+        <w:t xml:space="preserve">) and performance metrics (</w:t>
+      </w:r>
+      <w:r>
+        <w:rPr>
+          <w:rStyle w:val="VerbatimChar"/>
+        </w:rPr>
+        <w:t xml:space="preserve">cv_metrics.json</w:t>
+      </w:r>
+      <w:r>
+        <w:t xml:space="preserve">) to disk after every single fold. If a session is interrupted, re-running the script automatically skips completed folds and resumes exactly where it stopped.</w:t>
+      </w:r>
+    </w:p>
+    <w:p>
+      <w:pPr>
+        <w:pStyle w:val="Compact"/>
+        <w:numPr>
+          <w:ilvl w:val="0"/>
+          <w:numId w:val="1002"/>
+        </w:numPr>
+      </w:pPr>
+      <w:r>
+        <w:rPr>
+          <w:b/>
+          <w:bCs/>
+        </w:rPr>
+        <w:t xml:space="preserve">Automated Figure Generation:</w:t>
+      </w:r>
+      <w:r>
+        <w:t xml:space="preserve"> </w:t>
+      </w:r>
+      <w:r>
+        <w:t xml:space="preserve">Upon completion, the script automatically parses the finalized OOF arrays to generate all of the comparative graphs (ROC, PR Curve, Radar Chart, Heatmaps) featured in this report.</w:t>
       </w:r>
     </w:p>
     <w:p>
@@ -1088,24 +2673,26 @@
         </w:pict>
       </w:r>
     </w:p>
-    <w:bookmarkEnd w:id="18"/>
-    <w:bookmarkStart w:id="19" w:name="conclusion"/>
+    <w:bookmarkEnd w:id="49"/>
+    <w:bookmarkStart w:id="50" w:name="conclusion-next-steps"/>
     <w:p>
       <w:pPr>
         <w:pStyle w:val="Heading2"/>
       </w:pPr>
       <w:r>
-        <w:t xml:space="preserve">Conclusion</w:t>
-      </w:r>
-    </w:p>
-    <w:p>
-      <w:pPr>
-        <w:pStyle w:val="Compact"/>
-        <w:numPr>
-          <w:ilvl w:val="0"/>
-          <w:numId w:val="1001"/>
-        </w:numPr>
-      </w:pPr>
+        <w:t xml:space="preserve">6. Conclusion &amp; Next Steps</w:t>
+      </w:r>
+    </w:p>
+    <w:p>
+      <w:pPr>
+        <w:pStyle w:val="FirstParagraph"/>
+      </w:pPr>
+      <w:r>
+        <w:t xml:space="preserve">The benchmark confirms that pretrained CNN and Transformer baselines perform competitively on the ASD emotion-classification task, with</w:t>
+      </w:r>
+      <w:r>
+        <w:t xml:space="preserve"> </w:t>
+      </w:r>
       <w:r>
         <w:rPr>
           <w:b/>
@@ -1117,17 +2704,11 @@
         <w:t xml:space="preserve"> </w:t>
       </w:r>
       <w:r>
-        <w:t xml:space="preserve">achieved the best overall performance among all baseline models.</w:t>
-      </w:r>
-    </w:p>
-    <w:p>
-      <w:pPr>
-        <w:pStyle w:val="Compact"/>
-        <w:numPr>
-          <w:ilvl w:val="0"/>
-          <w:numId w:val="1001"/>
-        </w:numPr>
-      </w:pPr>
+        <w:t xml:space="preserve">and</w:t>
+      </w:r>
+      <w:r>
+        <w:t xml:space="preserve"> </w:t>
+      </w:r>
       <w:r>
         <w:rPr>
           <w:b/>
@@ -1139,35 +2720,63 @@
         <w:t xml:space="preserve"> </w:t>
       </w:r>
       <w:r>
-        <w:t xml:space="preserve">produced comparable accuracy, demonstrating the effectiveness of Transformer-based models.</w:t>
-      </w:r>
-    </w:p>
-    <w:p>
-      <w:pPr>
-        <w:pStyle w:val="Compact"/>
-        <w:numPr>
-          <w:ilvl w:val="0"/>
-          <w:numId w:val="1001"/>
-        </w:numPr>
-      </w:pPr>
-      <w:r>
-        <w:t xml:space="preserve">All baseline models achieved approximately 68-72% accuracy, indicating that further improvements require architectural innovation rather than simply changing the backbone.</w:t>
-      </w:r>
-    </w:p>
-    <w:p>
-      <w:pPr>
-        <w:pStyle w:val="Compact"/>
-        <w:numPr>
-          <w:ilvl w:val="0"/>
-          <w:numId w:val="1001"/>
-        </w:numPr>
-      </w:pPr>
-      <w:r>
-        <w:t xml:space="preserve">Based on these findings, the next stage of this research is to develop a proposed dual-stream architecture by combining CNN and Transformer features.</w:t>
-      </w:r>
-    </w:p>
-    <w:bookmarkEnd w:id="19"/>
-    <w:bookmarkEnd w:id="20"/>
+        <w:t xml:space="preserve">leading on the majority of metrics. The main remaining weakness is misclassification between the rare and visually similar</w:t>
+      </w:r>
+      <w:r>
+        <w:t xml:space="preserve"> </w:t>
+      </w:r>
+      <w:r>
+        <w:rPr>
+          <w:i/>
+          <w:iCs/>
+        </w:rPr>
+        <w:t xml:space="preserve">fear</w:t>
+      </w:r>
+      <w:r>
+        <w:t xml:space="preserve"> </w:t>
+      </w:r>
+      <w:r>
+        <w:t xml:space="preserve">and</w:t>
+      </w:r>
+      <w:r>
+        <w:t xml:space="preserve"> </w:t>
+      </w:r>
+      <w:r>
+        <w:rPr>
+          <w:i/>
+          <w:iCs/>
+        </w:rPr>
+        <w:t xml:space="preserve">surprise</w:t>
+      </w:r>
+      <w:r>
+        <w:t xml:space="preserve"> </w:t>
+      </w:r>
+      <w:r>
+        <w:t xml:space="preserve">classes.</w:t>
+      </w:r>
+    </w:p>
+    <w:p>
+      <w:pPr>
+        <w:pStyle w:val="BodyText"/>
+      </w:pPr>
+      <w:r>
+        <w:t xml:space="preserve">The correlation analysis reveals complementary behavior between CNN- and Transformer-based models. This motivates the</w:t>
+      </w:r>
+      <w:r>
+        <w:t xml:space="preserve"> </w:t>
+      </w:r>
+      <w:r>
+        <w:rPr>
+          <w:b/>
+          <w:bCs/>
+        </w:rPr>
+        <w:t xml:space="preserve">next phase</w:t>
+      </w:r>
+      <w:r>
+        <w:t xml:space="preserve">: designing and training a hybrid CNN-Transformer (dual-stream) architecture that combines the spatial detail of CNNs with the global context of Transformers, explicitly targeting the minority-class errors highlighted in this report.</w:t>
+      </w:r>
+    </w:p>
+    <w:bookmarkEnd w:id="50"/>
     <w:sectPr>
       <w:footnotePr>
         <w:numRestart w:val="eachSect"/>
@@ -1385,6 +2994,9 @@
     <w:abstractNumId w:val="990"/>
   </w:num>
   <w:num w:numId="1001">
+    <w:abstractNumId w:val="991"/>
+  </w:num>
+  <w:num w:numId="1002">
     <w:abstractNumId w:val="991"/>
   </w:num>
 </w:numbering>

</xml_diff>

<commit_message>
docs: update model comparison report with dataset link, refined formatting, and improved layout
</commit_message>
<xml_diff>
--- a/model_comparison_report.docx
+++ b/model_comparison_report.docx
@@ -2,37 +2,33 @@
 <file path=word/document.xml><?xml version="1.0" encoding="utf-8"?>
 <w:document xmlns:w="http://schemas.openxmlformats.org/wordprocessingml/2006/main" xmlns:m="http://schemas.openxmlformats.org/officeDocument/2006/math" xmlns:r="http://schemas.openxmlformats.org/officeDocument/2006/relationships" xmlns:o="urn:schemas-microsoft-com:office:office" xmlns:v="urn:schemas-microsoft-com:vml" xmlns:w10="urn:schemas-microsoft-com:office:word" xmlns:a="http://schemas.openxmlformats.org/drawingml/2006/main" xmlns:pic="http://schemas.openxmlformats.org/drawingml/2006/picture" xmlns:wp="http://schemas.openxmlformats.org/drawingml/2006/wordprocessingDrawing">
   <w:body>
-    <w:p>
-      <w:pPr>
-        <w:pStyle w:val="Title"/>
-      </w:pPr>
-      <w:r>
-        <w:t xml:space="preserve">Autism Facial Emotion Recognition</w:t>
-      </w:r>
-    </w:p>
-    <w:p>
-      <w:pPr>
-        <w:pStyle w:val="Subtitle"/>
-      </w:pPr>
-      <w:r>
-        <w:t xml:space="preserve">Project Progress &amp; Baseline Model Comparison</w:t>
-      </w:r>
-    </w:p>
-    <w:p>
-      <w:pPr>
-        <w:pStyle w:val="Date"/>
-      </w:pPr>
-      <w:r>
-        <w:t xml:space="preserve">August 2026</w:t>
-      </w:r>
-    </w:p>
-    <w:bookmarkStart w:id="9" w:name="abstract"/>
+    <w:bookmarkStart w:id="49" w:name="autism-facial-emotion-recognition"/>
+    <w:p>
+      <w:pPr>
+        <w:pStyle w:val="Heading1"/>
+      </w:pPr>
+      <w:r>
+        <w:t xml:space="preserve">Autism Facial Emotion Recognition:</w:t>
+      </w:r>
+      <w:r>
+        <w:br/>
+      </w:r>
+    </w:p>
+    <w:p>
+      <w:pPr>
+        <w:pStyle w:val="FirstParagraph"/>
+      </w:pPr>
+      <w:r>
+        <w:t xml:space="preserve">Project Progress &amp; Baseline Comparison</w:t>
+      </w:r>
+    </w:p>
+    <w:bookmarkStart w:id="9" w:name="project-overview"/>
     <w:p>
       <w:pPr>
         <w:pStyle w:val="Heading2"/>
       </w:pPr>
       <w:r>
-        <w:t xml:space="preserve">Abstract</w:t>
+        <w:t xml:space="preserve">1. Project Overview</w:t>
       </w:r>
     </w:p>
     <w:p>
@@ -40,74 +36,11 @@
         <w:pStyle w:val="FirstParagraph"/>
       </w:pPr>
       <w:r>
-        <w:t xml:space="preserve">This report documents the current state of a research project to develop a deep-learning framework that accurately classifies six fundamental facial emotions (anger, fear, joy, natural, sadness, surprise) in children with Autism Spectrum Disorder (ASD). Because children with ASD exhibit atypical facial dynamics (e.g., reduced symmetry, asynchronous activation), standard emotion-recognition models often struggle. We aggregate four small ASD-specific datasets into a unified corpus, benchmark ten standard CNN and Transformer baselines under stratified 5-fold cross-validation, and motivate a hybrid architecture for the next phase.</w:t>
-      </w:r>
-    </w:p>
-    <w:p>
-      <w:r>
-        <w:pict>
-          <v:rect style="width:0;height:1.5pt" o:hralign="center" o:hrstd="t" o:hr="t"/>
-        </w:pict>
+        <w:t xml:space="preserve">The goal of this research is to develop a deep learning framework to accurately classify six fundamental facial emotions (anger, fear, joy, natural, sadness, surprise) in children with Autism Spectrum Disorder (ASD). Because children with ASD express emotions differently—often with less symmetrical or synchronized facial movements—standard emotion recognition models usually struggle to read their faces.</w:t>
       </w:r>
     </w:p>
     <w:bookmarkEnd w:id="9"/>
-    <w:bookmarkStart w:id="10" w:name="project-overview"/>
-    <w:p>
-      <w:pPr>
-        <w:pStyle w:val="Heading2"/>
-      </w:pPr>
-      <w:r>
-        <w:t xml:space="preserve">1. Project Overview</w:t>
-      </w:r>
-    </w:p>
-    <w:p>
-      <w:pPr>
-        <w:pStyle w:val="FirstParagraph"/>
-      </w:pPr>
-      <w:r>
-        <w:t xml:space="preserve">The goal of this research is to develop a deep learning framework to accurately classify six fundamental facial emotions (</w:t>
-      </w:r>
-      <w:r>
-        <w:rPr>
-          <w:b/>
-          <w:bCs/>
-        </w:rPr>
-        <w:t xml:space="preserve">anger, fear, joy, natural, sadness, surprise</w:t>
-      </w:r>
-      <w:r>
-        <w:t xml:space="preserve">) in children with Autism Spectrum Disorder (ASD). Because children with ASD exhibit atypical facial dynamics (e.g., reduced symmetry, asynchronous activation), standard emotion recognition models often struggle to generalize to this population.</w:t>
-      </w:r>
-    </w:p>
-    <w:p>
-      <w:pPr>
-        <w:pStyle w:val="BodyText"/>
-      </w:pPr>
-      <w:r>
-        <w:t xml:space="preserve">The current phase establishes a rigorous</w:t>
-      </w:r>
-      <w:r>
-        <w:t xml:space="preserve"> </w:t>
-      </w:r>
-      <w:r>
-        <w:rPr>
-          <w:b/>
-          <w:bCs/>
-        </w:rPr>
-        <w:t xml:space="preserve">baseline benchmark</w:t>
-      </w:r>
-      <w:r>
-        <w:t xml:space="preserve">. We evaluate ten standard CNN and Transformer architectures on a unified, cleaned dataset using stratified 5-fold cross-validation. This benchmark defines the target performance threshold that our proposed hybrid architecture must exceed in the next phase.</w:t>
-      </w:r>
-    </w:p>
-    <w:p>
-      <w:r>
-        <w:pict>
-          <v:rect style="width:0;height:1.5pt" o:hralign="center" o:hrstd="t" o:hr="t"/>
-        </w:pict>
-      </w:r>
-    </w:p>
-    <w:bookmarkEnd w:id="10"/>
-    <w:bookmarkStart w:id="17" w:name="dataset"/>
+    <w:bookmarkStart w:id="15" w:name="dataset"/>
     <w:p>
       <w:pPr>
         <w:pStyle w:val="Heading2"/>
@@ -137,12 +70,12 @@
         <w:t xml:space="preserve"> </w:t>
       </w:r>
       <w:r>
-        <w:t xml:space="preserve">is</w:t>
+        <w:t xml:space="preserve">for this research is</w:t>
       </w:r>
       <w:r>
         <w:t xml:space="preserve"> </w:t>
       </w:r>
-      <w:hyperlink r:id="rId11">
+      <w:hyperlink r:id="rId10">
         <w:r>
           <w:rPr>
             <w:rStyle w:val="Hyperlink"/>
@@ -151,24 +84,15 @@
         </w:r>
       </w:hyperlink>
       <w:r>
-        <w:t xml:space="preserve">. Because ASD facial datasets are inherently small, we strategically merged the primary dataset with three other sources. This aggregation significantly increased the total number of images, allowing our models to learn more robust and generalized ASD-specific facial cues.</w:t>
-      </w:r>
-    </w:p>
-    <w:bookmarkStart w:id="15" w:name="data-sources"/>
-    <w:p>
-      <w:pPr>
-        <w:pStyle w:val="Heading3"/>
-      </w:pPr>
-      <w:r>
-        <w:t xml:space="preserve">2.1 Data Sources</w:t>
-      </w:r>
-    </w:p>
-    <w:p>
-      <w:pPr>
-        <w:pStyle w:val="FirstParagraph"/>
-      </w:pPr>
-      <w:r>
-        <w:t xml:space="preserve">The unified corpus is aggregated from the following four sources:</w:t>
+        <w:t xml:space="preserve">. However, because ASD facial datasets are inherently small, we strategically merged our primary dataset with three other sources. This aggregation significantly increased the total number of images, allowing our models to learn more robust and generalized ASD-specific facial cues.</w:t>
+      </w:r>
+    </w:p>
+    <w:p>
+      <w:pPr>
+        <w:pStyle w:val="BodyText"/>
+      </w:pPr>
+      <w:r>
+        <w:t xml:space="preserve">The unified corpus is aggregated from these 4 sources:</w:t>
       </w:r>
     </w:p>
     <w:tbl>
@@ -216,7 +140,7 @@
             <w:pPr>
               <w:pStyle w:val="Compact"/>
             </w:pPr>
-            <w:hyperlink r:id="rId11">
+            <w:hyperlink r:id="rId10">
               <w:r>
                 <w:rPr>
                   <w:rStyle w:val="Hyperlink"/>
@@ -255,7 +179,7 @@
             <w:pPr>
               <w:pStyle w:val="Compact"/>
             </w:pPr>
-            <w:hyperlink r:id="rId12">
+            <w:hyperlink r:id="rId11">
               <w:r>
                 <w:rPr>
                   <w:rStyle w:val="Hyperlink"/>
@@ -284,7 +208,7 @@
             <w:pPr>
               <w:pStyle w:val="Compact"/>
             </w:pPr>
-            <w:hyperlink r:id="rId13">
+            <w:hyperlink r:id="rId12">
               <w:r>
                 <w:rPr>
                   <w:rStyle w:val="Hyperlink"/>
@@ -313,7 +237,7 @@
             <w:pPr>
               <w:pStyle w:val="Compact"/>
             </w:pPr>
-            <w:hyperlink r:id="rId14">
+            <w:hyperlink r:id="rId13">
               <w:r>
                 <w:rPr>
                   <w:rStyle w:val="Hyperlink"/>
@@ -336,36 +260,22 @@
         </w:tc>
       </w:tr>
     </w:tbl>
-    <w:bookmarkEnd w:id="15"/>
-    <w:bookmarkStart w:id="16" w:name="cleaning-splitting"/>
-    <w:p>
-      <w:pPr>
-        <w:pStyle w:val="Heading3"/>
-      </w:pPr>
-      <w:r>
-        <w:t xml:space="preserve">2.2 Cleaning &amp; Splitting</w:t>
-      </w:r>
-    </w:p>
-    <w:p>
-      <w:pPr>
-        <w:pStyle w:val="Compact"/>
-        <w:numPr>
-          <w:ilvl w:val="0"/>
-          <w:numId w:val="1001"/>
-        </w:numPr>
+    <w:p>
+      <w:pPr>
+        <w:pStyle w:val="BodyText"/>
       </w:pPr>
       <w:r>
         <w:rPr>
           <w:b/>
           <w:bCs/>
         </w:rPr>
-        <w:t xml:space="preserve">Cleaning:</w:t>
+        <w:t xml:space="preserve">Data Cleaning &amp; Unique Raw Images:</w:t>
       </w:r>
       <w:r>
         <w:t xml:space="preserve"> </w:t>
       </w:r>
       <w:r>
-        <w:t xml:space="preserve">We took only the unique, raw images from all collected datasets and combined them to create a new, clean dataset (</w:t>
+        <w:t xml:space="preserve">We took only the unique, raw images from all the collected datasets and combined them to create a new, clean dataset (</w:t>
       </w:r>
       <w:r>
         <w:rPr>
@@ -374,23 +284,33 @@
         <w:t xml:space="preserve">dataset_clean/</w:t>
       </w:r>
       <w:r>
-        <w:t xml:space="preserve">).</w:t>
-      </w:r>
-    </w:p>
-    <w:p>
-      <w:pPr>
-        <w:pStyle w:val="Compact"/>
-        <w:numPr>
-          <w:ilvl w:val="0"/>
-          <w:numId w:val="1001"/>
-        </w:numPr>
+        <w:t xml:space="preserve">). You can access our final merged dataset here:</w:t>
+      </w:r>
+      <w:r>
+        <w:t xml:space="preserve"> </w:t>
+      </w:r>
+      <w:hyperlink r:id="rId14">
+        <w:r>
+          <w:rPr>
+            <w:rStyle w:val="Hyperlink"/>
+          </w:rPr>
+          <w:t xml:space="preserve">Merged Dataset (Google Drive)</w:t>
+        </w:r>
+      </w:hyperlink>
+      <w:r>
+        <w:t xml:space="preserve">.</w:t>
+      </w:r>
+    </w:p>
+    <w:p>
+      <w:pPr>
+        <w:pStyle w:val="BodyText"/>
       </w:pPr>
       <w:r>
         <w:rPr>
           <w:b/>
           <w:bCs/>
         </w:rPr>
-        <w:t xml:space="preserve">Splitting:</w:t>
+        <w:t xml:space="preserve">Data Splitting:</w:t>
       </w:r>
       <w:r>
         <w:t xml:space="preserve"> </w:t>
@@ -412,19 +332,19 @@
         <w:t xml:space="preserve"> </w:t>
       </w:r>
       <w:r>
-        <w:t xml:space="preserve">ratio (Train / Validation / Test).</w:t>
-      </w:r>
-    </w:p>
-    <w:p>
-      <w:pPr>
-        <w:pStyle w:val="FirstParagraph"/>
+        <w:t xml:space="preserve">ratio (Train/Validation/Test).</w:t>
+      </w:r>
+    </w:p>
+    <w:p>
+      <w:pPr>
+        <w:pStyle w:val="BodyText"/>
       </w:pPr>
       <w:r>
         <w:rPr>
           <w:b/>
           <w:bCs/>
         </w:rPr>
-        <w:t xml:space="preserve">Final per-class split</w:t>
+        <w:t xml:space="preserve">Final split</w:t>
       </w:r>
       <w:r>
         <w:t xml:space="preserve"> </w:t>
@@ -445,19 +365,18 @@
     <w:tbl>
       <w:tblPr>
         <w:tblStyle w:val="Table"/>
-        <w:tblW w:type="pct" w:w="5000"/>
-        <w:tblLayout w:type="fixed"/>
+        <w:tblW w:type="auto" w:w="0"/>
         <w:tblLook w:firstRow="1" w:lastRow="0" w:firstColumn="0" w:lastColumn="0" w:noHBand="0" w:noVBand="0" w:val="0020"/>
       </w:tblPr>
       <w:tblGrid>
-        <w:gridCol w:w="924"/>
-        <w:gridCol w:w="924"/>
-        <w:gridCol w:w="792"/>
-        <w:gridCol w:w="660"/>
-        <w:gridCol w:w="1188"/>
-        <w:gridCol w:w="1188"/>
-        <w:gridCol w:w="1320"/>
-        <w:gridCol w:w="924"/>
+        <w:gridCol w:w="990"/>
+        <w:gridCol w:w="990"/>
+        <w:gridCol w:w="990"/>
+        <w:gridCol w:w="990"/>
+        <w:gridCol w:w="990"/>
+        <w:gridCol w:w="990"/>
+        <w:gridCol w:w="990"/>
+        <w:gridCol w:w="990"/>
       </w:tblGrid>
       <w:tr>
         <w:trPr>
@@ -878,7 +797,7 @@
         <w:t xml:space="preserve"> </w:t>
       </w:r>
       <w:r>
-        <w:t xml:space="preserve">joy (602) vs fear (60) is a 10:1 ratio. This is mitigated via a</w:t>
+        <w:t xml:space="preserve">joy (602) vs fear (60) = 10:1 ratio. Mitigated via</w:t>
       </w:r>
       <w:r>
         <w:t xml:space="preserve"> </w:t>
@@ -893,19 +812,11 @@
         <w:t xml:space="preserve"> </w:t>
       </w:r>
       <w:r>
-        <w:t xml:space="preserve">at the DataLoader level (loss is left unweighted to avoid double-weighting).</w:t>
-      </w:r>
-    </w:p>
-    <w:p>
-      <w:r>
-        <w:pict>
-          <v:rect style="width:0;height:1.5pt" o:hralign="center" o:hrstd="t" o:hr="t"/>
-        </w:pict>
-      </w:r>
-    </w:p>
-    <w:bookmarkEnd w:id="16"/>
-    <w:bookmarkEnd w:id="17"/>
-    <w:bookmarkStart w:id="19" w:name="baseline-model-comparison"/>
+        <w:t xml:space="preserve">(loss is unweighted to avoid double-weighting).</w:t>
+      </w:r>
+    </w:p>
+    <w:bookmarkEnd w:id="15"/>
+    <w:bookmarkStart w:id="17" w:name="baseline-model-comparison"/>
     <w:p>
       <w:pPr>
         <w:pStyle w:val="Heading2"/>
@@ -919,61 +830,16 @@
         <w:pStyle w:val="FirstParagraph"/>
       </w:pPr>
       <w:r>
-        <w:t xml:space="preserve">We evaluated</w:t>
-      </w:r>
-      <w:r>
-        <w:t xml:space="preserve"> </w:t>
-      </w:r>
-      <w:r>
-        <w:rPr>
-          <w:b/>
-          <w:bCs/>
-        </w:rPr>
-        <w:t xml:space="preserve">10 standard baseline models</w:t>
-      </w:r>
-      <w:r>
-        <w:t xml:space="preserve"> </w:t>
-      </w:r>
-      <w:r>
-        <w:t xml:space="preserve">on the unaugmented raw dataset using a</w:t>
-      </w:r>
-      <w:r>
-        <w:t xml:space="preserve"> </w:t>
-      </w:r>
-      <w:r>
-        <w:rPr>
-          <w:b/>
-          <w:bCs/>
-        </w:rPr>
-        <w:t xml:space="preserve">Stratified 5-Fold Cross-Validation</w:t>
-      </w:r>
-      <w:r>
-        <w:t xml:space="preserve"> </w:t>
-      </w:r>
-      <w:r>
-        <w:t xml:space="preserve">approach to establish our benchmark. Every image is predicted exactly once out-of-fold (OOF), making metrics for rare classes (such as</w:t>
-      </w:r>
-      <w:r>
-        <w:t xml:space="preserve"> </w:t>
-      </w:r>
-      <w:r>
-        <w:rPr>
-          <w:i/>
-          <w:iCs/>
-        </w:rPr>
-        <w:t xml:space="preserve">fear</w:t>
-      </w:r>
-      <w:r>
-        <w:t xml:space="preserve">) statistically defensible.</w:t>
-      </w:r>
-    </w:p>
-    <w:bookmarkStart w:id="18" w:name="summary-table"/>
+        <w:t xml:space="preserve">We evaluated 10 standard baseline models on the unaugmented raw dataset using a Stratified 5-Fold Cross-Validation approach to establish our benchmark.</w:t>
+      </w:r>
+    </w:p>
+    <w:bookmarkStart w:id="16" w:name="summary-table"/>
     <w:p>
       <w:pPr>
         <w:pStyle w:val="Heading3"/>
       </w:pPr>
       <w:r>
-        <w:t xml:space="preserve">3.1 Summary Table</w:t>
+        <w:t xml:space="preserve">Summary Table</w:t>
       </w:r>
     </w:p>
     <w:tbl>
@@ -1009,7 +875,6 @@
           <w:p>
             <w:pPr>
               <w:pStyle w:val="Compact"/>
-              <w:jc w:val="right"/>
             </w:pPr>
             <w:r>
               <w:t xml:space="preserve">Accuracy</w:t>
@@ -1021,7 +886,6 @@
           <w:p>
             <w:pPr>
               <w:pStyle w:val="Compact"/>
-              <w:jc w:val="right"/>
             </w:pPr>
             <w:r>
               <w:t xml:space="preserve">F1-Macro</w:t>
@@ -1033,7 +897,6 @@
           <w:p>
             <w:pPr>
               <w:pStyle w:val="Compact"/>
-              <w:jc w:val="right"/>
             </w:pPr>
             <w:r>
               <w:t xml:space="preserve">Precision</w:t>
@@ -1045,7 +908,6 @@
           <w:p>
             <w:pPr>
               <w:pStyle w:val="Compact"/>
-              <w:jc w:val="right"/>
             </w:pPr>
             <w:r>
               <w:t xml:space="preserve">Recall</w:t>
@@ -1074,7 +936,6 @@
           <w:p>
             <w:pPr>
               <w:pStyle w:val="Compact"/>
-              <w:jc w:val="right"/>
             </w:pPr>
             <w:r>
               <w:rPr>
@@ -1090,7 +951,6 @@
           <w:p>
             <w:pPr>
               <w:pStyle w:val="Compact"/>
-              <w:jc w:val="right"/>
             </w:pPr>
             <w:r>
               <w:rPr>
@@ -1106,7 +966,6 @@
           <w:p>
             <w:pPr>
               <w:pStyle w:val="Compact"/>
-              <w:jc w:val="right"/>
             </w:pPr>
             <w:r>
               <w:rPr>
@@ -1122,7 +981,6 @@
           <w:p>
             <w:pPr>
               <w:pStyle w:val="Compact"/>
-              <w:jc w:val="right"/>
             </w:pPr>
             <w:r>
               <w:rPr>
@@ -1155,7 +1013,6 @@
           <w:p>
             <w:pPr>
               <w:pStyle w:val="Compact"/>
-              <w:jc w:val="right"/>
             </w:pPr>
             <w:r>
               <w:t xml:space="preserve">0.7201</w:t>
@@ -1167,7 +1024,6 @@
           <w:p>
             <w:pPr>
               <w:pStyle w:val="Compact"/>
-              <w:jc w:val="right"/>
             </w:pPr>
             <w:r>
               <w:t xml:space="preserve">0.6100</w:t>
@@ -1179,7 +1035,6 @@
           <w:p>
             <w:pPr>
               <w:pStyle w:val="Compact"/>
-              <w:jc w:val="right"/>
             </w:pPr>
             <w:r>
               <w:t xml:space="preserve">0.5961</w:t>
@@ -1191,7 +1046,6 @@
           <w:p>
             <w:pPr>
               <w:pStyle w:val="Compact"/>
-              <w:jc w:val="right"/>
             </w:pPr>
             <w:r>
               <w:t xml:space="preserve">0.6485</w:t>
@@ -1220,7 +1074,6 @@
           <w:p>
             <w:pPr>
               <w:pStyle w:val="Compact"/>
-              <w:jc w:val="right"/>
             </w:pPr>
             <w:r>
               <w:t xml:space="preserve">0.7196</w:t>
@@ -1232,7 +1085,6 @@
           <w:p>
             <w:pPr>
               <w:pStyle w:val="Compact"/>
-              <w:jc w:val="right"/>
             </w:pPr>
             <w:r>
               <w:t xml:space="preserve">0.6067</w:t>
@@ -1244,7 +1096,6 @@
           <w:p>
             <w:pPr>
               <w:pStyle w:val="Compact"/>
-              <w:jc w:val="right"/>
             </w:pPr>
             <w:r>
               <w:t xml:space="preserve">0.6030</w:t>
@@ -1256,7 +1107,6 @@
           <w:p>
             <w:pPr>
               <w:pStyle w:val="Compact"/>
-              <w:jc w:val="right"/>
             </w:pPr>
             <w:r>
               <w:t xml:space="preserve">0.6363</w:t>
@@ -1285,7 +1135,6 @@
           <w:p>
             <w:pPr>
               <w:pStyle w:val="Compact"/>
-              <w:jc w:val="right"/>
             </w:pPr>
             <w:r>
               <w:t xml:space="preserve">0.7113</w:t>
@@ -1297,7 +1146,6 @@
           <w:p>
             <w:pPr>
               <w:pStyle w:val="Compact"/>
-              <w:jc w:val="right"/>
             </w:pPr>
             <w:r>
               <w:t xml:space="preserve">0.6026</w:t>
@@ -1309,7 +1157,6 @@
           <w:p>
             <w:pPr>
               <w:pStyle w:val="Compact"/>
-              <w:jc w:val="right"/>
             </w:pPr>
             <w:r>
               <w:t xml:space="preserve">0.5895</w:t>
@@ -1321,7 +1168,6 @@
           <w:p>
             <w:pPr>
               <w:pStyle w:val="Compact"/>
-              <w:jc w:val="right"/>
             </w:pPr>
             <w:r>
               <w:t xml:space="preserve">0.6417</w:t>
@@ -1350,7 +1196,6 @@
           <w:p>
             <w:pPr>
               <w:pStyle w:val="Compact"/>
-              <w:jc w:val="right"/>
             </w:pPr>
             <w:r>
               <w:t xml:space="preserve">0.7113</w:t>
@@ -1362,7 +1207,6 @@
           <w:p>
             <w:pPr>
               <w:pStyle w:val="Compact"/>
-              <w:jc w:val="right"/>
             </w:pPr>
             <w:r>
               <w:t xml:space="preserve">0.6001</w:t>
@@ -1374,7 +1218,6 @@
           <w:p>
             <w:pPr>
               <w:pStyle w:val="Compact"/>
-              <w:jc w:val="right"/>
             </w:pPr>
             <w:r>
               <w:t xml:space="preserve">0.5894</w:t>
@@ -1386,7 +1229,6 @@
           <w:p>
             <w:pPr>
               <w:pStyle w:val="Compact"/>
-              <w:jc w:val="right"/>
             </w:pPr>
             <w:r>
               <w:t xml:space="preserve">0.6298</w:t>
@@ -1415,7 +1257,6 @@
           <w:p>
             <w:pPr>
               <w:pStyle w:val="Compact"/>
-              <w:jc w:val="right"/>
             </w:pPr>
             <w:r>
               <w:t xml:space="preserve">0.7102</w:t>
@@ -1427,7 +1268,6 @@
           <w:p>
             <w:pPr>
               <w:pStyle w:val="Compact"/>
-              <w:jc w:val="right"/>
             </w:pPr>
             <w:r>
               <w:t xml:space="preserve">0.5984</w:t>
@@ -1439,7 +1279,6 @@
           <w:p>
             <w:pPr>
               <w:pStyle w:val="Compact"/>
-              <w:jc w:val="right"/>
             </w:pPr>
             <w:r>
               <w:t xml:space="preserve">0.5880</w:t>
@@ -1451,7 +1290,6 @@
           <w:p>
             <w:pPr>
               <w:pStyle w:val="Compact"/>
-              <w:jc w:val="right"/>
             </w:pPr>
             <w:r>
               <w:t xml:space="preserve">0.6339</w:t>
@@ -1480,7 +1318,6 @@
           <w:p>
             <w:pPr>
               <w:pStyle w:val="Compact"/>
-              <w:jc w:val="right"/>
             </w:pPr>
             <w:r>
               <w:t xml:space="preserve">0.7030</w:t>
@@ -1492,7 +1329,6 @@
           <w:p>
             <w:pPr>
               <w:pStyle w:val="Compact"/>
-              <w:jc w:val="right"/>
             </w:pPr>
             <w:r>
               <w:t xml:space="preserve">0.5972</w:t>
@@ -1504,7 +1340,6 @@
           <w:p>
             <w:pPr>
               <w:pStyle w:val="Compact"/>
-              <w:jc w:val="right"/>
             </w:pPr>
             <w:r>
               <w:t xml:space="preserve">0.5827</w:t>
@@ -1516,7 +1351,6 @@
           <w:p>
             <w:pPr>
               <w:pStyle w:val="Compact"/>
-              <w:jc w:val="right"/>
             </w:pPr>
             <w:r>
               <w:t xml:space="preserve">0.6381</w:t>
@@ -1545,7 +1379,6 @@
           <w:p>
             <w:pPr>
               <w:pStyle w:val="Compact"/>
-              <w:jc w:val="right"/>
             </w:pPr>
             <w:r>
               <w:t xml:space="preserve">0.6980</w:t>
@@ -1557,7 +1390,6 @@
           <w:p>
             <w:pPr>
               <w:pStyle w:val="Compact"/>
-              <w:jc w:val="right"/>
             </w:pPr>
             <w:r>
               <w:t xml:space="preserve">0.5871</w:t>
@@ -1569,7 +1401,6 @@
           <w:p>
             <w:pPr>
               <w:pStyle w:val="Compact"/>
-              <w:jc w:val="right"/>
             </w:pPr>
             <w:r>
               <w:t xml:space="preserve">0.5813</w:t>
@@ -1581,7 +1412,6 @@
           <w:p>
             <w:pPr>
               <w:pStyle w:val="Compact"/>
-              <w:jc w:val="right"/>
             </w:pPr>
             <w:r>
               <w:t xml:space="preserve">0.6167</w:t>
@@ -1610,7 +1440,6 @@
           <w:p>
             <w:pPr>
               <w:pStyle w:val="Compact"/>
-              <w:jc w:val="right"/>
             </w:pPr>
             <w:r>
               <w:t xml:space="preserve">0.6858</w:t>
@@ -1622,7 +1451,6 @@
           <w:p>
             <w:pPr>
               <w:pStyle w:val="Compact"/>
-              <w:jc w:val="right"/>
             </w:pPr>
             <w:r>
               <w:t xml:space="preserve">0.5790</w:t>
@@ -1634,7 +1462,6 @@
           <w:p>
             <w:pPr>
               <w:pStyle w:val="Compact"/>
-              <w:jc w:val="right"/>
             </w:pPr>
             <w:r>
               <w:t xml:space="preserve">0.5687</w:t>
@@ -1646,7 +1473,6 @@
           <w:p>
             <w:pPr>
               <w:pStyle w:val="Compact"/>
-              <w:jc w:val="right"/>
             </w:pPr>
             <w:r>
               <w:t xml:space="preserve">0.6174</w:t>
@@ -1675,7 +1501,6 @@
           <w:p>
             <w:pPr>
               <w:pStyle w:val="Compact"/>
-              <w:jc w:val="right"/>
             </w:pPr>
             <w:r>
               <w:t xml:space="preserve">0.6825</w:t>
@@ -1687,7 +1512,6 @@
           <w:p>
             <w:pPr>
               <w:pStyle w:val="Compact"/>
-              <w:jc w:val="right"/>
             </w:pPr>
             <w:r>
               <w:t xml:space="preserve">0.5762</w:t>
@@ -1699,7 +1523,6 @@
           <w:p>
             <w:pPr>
               <w:pStyle w:val="Compact"/>
-              <w:jc w:val="right"/>
             </w:pPr>
             <w:r>
               <w:t xml:space="preserve">0.5652</w:t>
@@ -1711,7 +1534,6 @@
           <w:p>
             <w:pPr>
               <w:pStyle w:val="Compact"/>
-              <w:jc w:val="right"/>
             </w:pPr>
             <w:r>
               <w:t xml:space="preserve">0.6150</w:t>
@@ -1720,24 +1542,6 @@
         </w:tc>
       </w:tr>
     </w:tbl>
-    <w:p>
-      <w:pPr>
-        <w:pStyle w:val="BlockText"/>
-      </w:pPr>
-      <w:r>
-        <w:rPr>
-          <w:b/>
-          <w:bCs/>
-        </w:rPr>
-        <w:t xml:space="preserve">Result:</w:t>
-      </w:r>
-      <w:r>
-        <w:t xml:space="preserve"> </w:t>
-      </w:r>
-      <w:r>
-        <w:t xml:space="preserve">VGG-16 achieves the highest Macro-F1 (0.6217) and recall (0.6725), tied with Swin Base on accuracy (0.7201).</w:t>
-      </w:r>
-    </w:p>
     <w:p>
       <w:r>
         <w:pict>
@@ -1745,32 +1549,24 @@
         </w:pict>
       </w:r>
     </w:p>
-    <w:bookmarkEnd w:id="18"/>
-    <w:bookmarkEnd w:id="19"/>
-    <w:bookmarkStart w:id="48" w:name="key-charts-takeaways"/>
+    <w:bookmarkEnd w:id="16"/>
+    <w:bookmarkEnd w:id="17"/>
+    <w:bookmarkStart w:id="22" w:name="key-charts-and-takeaways"/>
     <w:p>
       <w:pPr>
         <w:pStyle w:val="Heading2"/>
       </w:pPr>
       <w:r>
-        <w:t xml:space="preserve">4. Key Charts &amp; Takeaways</w:t>
-      </w:r>
-    </w:p>
-    <w:p>
-      <w:pPr>
-        <w:pStyle w:val="FirstParagraph"/>
-      </w:pPr>
-      <w:r>
-        <w:t xml:space="preserve">This section presents the comparative visualizations generated from the out-of-fold predictions of all baseline models.</w:t>
-      </w:r>
-    </w:p>
-    <w:bookmarkStart w:id="23" w:name="overall-performance"/>
+        <w:t xml:space="preserve">4. Key Charts and Takeaways</w:t>
+      </w:r>
+    </w:p>
+    <w:bookmarkStart w:id="21" w:name="overall-performance"/>
     <w:p>
       <w:pPr>
         <w:pStyle w:val="Heading3"/>
       </w:pPr>
       <w:r>
-        <w:t xml:space="preserve">4.1 Overall Performance</w:t>
+        <w:t xml:space="preserve">1. Overall Performance</w:t>
       </w:r>
     </w:p>
     <w:p>
@@ -1780,20 +1576,20 @@
       <w:r>
         <w:drawing>
           <wp:inline>
-            <wp:extent cx="4859999" cy="2429999"/>
+            <wp:extent cx="4286250" cy="2143125"/>
             <wp:effectExtent b="0" l="0" r="0" t="0"/>
-            <wp:docPr descr="Grouped bar chart comparing accuracy, precision, recall, and Macro-F1 across all ten baselines." title="" id="21" name="Picture"/>
+            <wp:docPr descr="Grouped Bar Metrics" title="" id="19" name="Picture"/>
             <a:graphic>
               <a:graphicData uri="http://schemas.openxmlformats.org/drawingml/2006/picture">
                 <pic:pic>
                   <pic:nvPicPr>
-                    <pic:cNvPr descr="results/results/paper_figures/1_cv_grouped_bar_metrics.png" id="22" name="Picture"/>
+                    <pic:cNvPr descr="results/results/paper_figures/1_cv_grouped_bar_metrics.png" id="20" name="Picture"/>
                     <pic:cNvPicPr>
                       <a:picLocks noChangeArrowheads="1" noChangeAspect="1"/>
                     </pic:cNvPicPr>
                   </pic:nvPicPr>
                   <pic:blipFill>
-                    <a:blip r:embed="rId20"/>
+                    <a:blip r:embed="rId18"/>
                     <a:stretch>
                       <a:fillRect/>
                     </a:stretch>
@@ -1801,7 +1597,7 @@
                   <pic:spPr bwMode="auto">
                     <a:xfrm>
                       <a:off x="0" y="0"/>
-                      <a:ext cx="4859999" cy="2429999"/>
+                      <a:ext cx="4286250" cy="2143125"/>
                     </a:xfrm>
                     <a:prstGeom prst="rect">
                       <a:avLst/>
@@ -1825,7 +1621,7 @@
         <w:pStyle w:val="ImageCaption"/>
       </w:pPr>
       <w:r>
-        <w:t xml:space="preserve">Grouped bar chart comparing accuracy, precision, recall, and Macro-F1 across all ten baselines.</w:t>
+        <w:t xml:space="preserve">Grouped Bar Metrics</w:t>
       </w:r>
     </w:p>
     <w:p>
@@ -1846,14 +1642,15 @@
         <w:t xml:space="preserve">VGG-16 and Swin Base achieved the highest overall performance across the evaluated metrics, making them the strongest standard architectures.</w:t>
       </w:r>
     </w:p>
-    <w:bookmarkEnd w:id="23"/>
-    <w:bookmarkStart w:id="27" w:name="balancing-rare-emotions"/>
+    <w:bookmarkEnd w:id="21"/>
+    <w:bookmarkEnd w:id="22"/>
+    <w:bookmarkStart w:id="26" w:name="balancing-rare-emotions"/>
     <w:p>
       <w:pPr>
         <w:pStyle w:val="Heading3"/>
       </w:pPr>
       <w:r>
-        <w:t xml:space="preserve">4.2 Balancing Rare Emotions</w:t>
+        <w:t xml:space="preserve">2. Balancing Rare Emotions</w:t>
       </w:r>
     </w:p>
     <w:p>
@@ -1863,20 +1660,20 @@
       <w:r>
         <w:drawing>
           <wp:inline>
-            <wp:extent cx="4859999" cy="2429999"/>
+            <wp:extent cx="4286250" cy="2143125"/>
             <wp:effectExtent b="0" l="0" r="0" t="0"/>
-            <wp:docPr descr="Macro-F1 comparison across models, highlighting robustness to class imbalance." title="" id="25" name="Picture"/>
+            <wp:docPr descr="F1 Comparison" title="" id="24" name="Picture"/>
             <a:graphic>
               <a:graphicData uri="http://schemas.openxmlformats.org/drawingml/2006/picture">
                 <pic:pic>
                   <pic:nvPicPr>
-                    <pic:cNvPr descr="results/results/paper_figures/2_cv_f1_comparison.png" id="26" name="Picture"/>
+                    <pic:cNvPr descr="results/results/paper_figures/2_cv_f1_comparison.png" id="25" name="Picture"/>
                     <pic:cNvPicPr>
                       <a:picLocks noChangeArrowheads="1" noChangeAspect="1"/>
                     </pic:cNvPicPr>
                   </pic:nvPicPr>
                   <pic:blipFill>
-                    <a:blip r:embed="rId24"/>
+                    <a:blip r:embed="rId23"/>
                     <a:stretch>
                       <a:fillRect/>
                     </a:stretch>
@@ -1884,7 +1681,7 @@
                   <pic:spPr bwMode="auto">
                     <a:xfrm>
                       <a:off x="0" y="0"/>
-                      <a:ext cx="4859999" cy="2429999"/>
+                      <a:ext cx="4286250" cy="2143125"/>
                     </a:xfrm>
                     <a:prstGeom prst="rect">
                       <a:avLst/>
@@ -1908,7 +1705,7 @@
         <w:pStyle w:val="ImageCaption"/>
       </w:pPr>
       <w:r>
-        <w:t xml:space="preserve">Macro-F1 comparison across models, highlighting robustness to class imbalance.</w:t>
+        <w:t xml:space="preserve">F1 Comparison</w:t>
       </w:r>
     </w:p>
     <w:p>
@@ -1929,14 +1726,14 @@
         <w:t xml:space="preserve">The Macro-F1 score indicates how effectively a model manages class imbalance rather than defaulting to majority classes. CNNs currently set the benchmark for maintaining precision on minority classes.</w:t>
       </w:r>
     </w:p>
-    <w:bookmarkEnd w:id="27"/>
-    <w:bookmarkStart w:id="31" w:name="roc-curve-top-models"/>
+    <w:bookmarkEnd w:id="26"/>
+    <w:bookmarkStart w:id="30" w:name="roc-curve-top-models"/>
     <w:p>
       <w:pPr>
         <w:pStyle w:val="Heading3"/>
       </w:pPr>
       <w:r>
-        <w:t xml:space="preserve">4.3 ROC Curve (Top Models)</w:t>
+        <w:t xml:space="preserve">3. ROC Curve (Top Models)</w:t>
       </w:r>
     </w:p>
     <w:p>
@@ -1946,20 +1743,20 @@
       <w:r>
         <w:drawing>
           <wp:inline>
-            <wp:extent cx="4859999" cy="3887999"/>
+            <wp:extent cx="4286250" cy="3429000"/>
             <wp:effectExtent b="0" l="0" r="0" t="0"/>
-            <wp:docPr descr="Receiver-operating-characteristic (ROC) curves for the top-performing models." title="" id="29" name="Picture"/>
+            <wp:docPr descr="ROC Curve" title="" id="28" name="Picture"/>
             <a:graphic>
               <a:graphicData uri="http://schemas.openxmlformats.org/drawingml/2006/picture">
                 <pic:pic>
                   <pic:nvPicPr>
-                    <pic:cNvPr descr="results/results/paper_figures/3_roc_curve.png" id="30" name="Picture"/>
+                    <pic:cNvPr descr="results/results/paper_figures/3_roc_curve.png" id="29" name="Picture"/>
                     <pic:cNvPicPr>
                       <a:picLocks noChangeArrowheads="1" noChangeAspect="1"/>
                     </pic:cNvPicPr>
                   </pic:nvPicPr>
                   <pic:blipFill>
-                    <a:blip r:embed="rId28"/>
+                    <a:blip r:embed="rId27"/>
                     <a:stretch>
                       <a:fillRect/>
                     </a:stretch>
@@ -1967,7 +1764,7 @@
                   <pic:spPr bwMode="auto">
                     <a:xfrm>
                       <a:off x="0" y="0"/>
-                      <a:ext cx="4859999" cy="3887999"/>
+                      <a:ext cx="4286250" cy="3429000"/>
                     </a:xfrm>
                     <a:prstGeom prst="rect">
                       <a:avLst/>
@@ -1991,7 +1788,7 @@
         <w:pStyle w:val="ImageCaption"/>
       </w:pPr>
       <w:r>
-        <w:t xml:space="preserve">Receiver-operating-characteristic (ROC) curves for the top-performing models.</w:t>
+        <w:t xml:space="preserve">ROC Curve</w:t>
       </w:r>
     </w:p>
     <w:p>
@@ -2012,14 +1809,14 @@
         <w:t xml:space="preserve">The leading models achieve high Area Under the Curve (AUC) scores, demonstrating that the raw image data contains sufficient discriminatory features for accurate classification.</w:t>
       </w:r>
     </w:p>
-    <w:bookmarkEnd w:id="31"/>
-    <w:bookmarkStart w:id="35" w:name="precision-vs.-recall"/>
+    <w:bookmarkEnd w:id="30"/>
+    <w:bookmarkStart w:id="34" w:name="precision-vs-recall"/>
     <w:p>
       <w:pPr>
         <w:pStyle w:val="Heading3"/>
       </w:pPr>
       <w:r>
-        <w:t xml:space="preserve">4.4 Precision vs. Recall</w:t>
+        <w:t xml:space="preserve">4. Precision vs Recall</w:t>
       </w:r>
     </w:p>
     <w:p>
@@ -2029,20 +1826,20 @@
       <w:r>
         <w:drawing>
           <wp:inline>
-            <wp:extent cx="4859999" cy="3887999"/>
+            <wp:extent cx="4286250" cy="3429000"/>
             <wp:effectExtent b="0" l="0" r="0" t="0"/>
-            <wp:docPr descr="Precision-recall curves illustrating the trade-off for minority classes." title="" id="33" name="Picture"/>
+            <wp:docPr descr="Precision Recall Curve" title="" id="32" name="Picture"/>
             <a:graphic>
               <a:graphicData uri="http://schemas.openxmlformats.org/drawingml/2006/picture">
                 <pic:pic>
                   <pic:nvPicPr>
-                    <pic:cNvPr descr="results/results/paper_figures/4_pr_curve.png" id="34" name="Picture"/>
+                    <pic:cNvPr descr="results/results/paper_figures/4_pr_curve.png" id="33" name="Picture"/>
                     <pic:cNvPicPr>
                       <a:picLocks noChangeArrowheads="1" noChangeAspect="1"/>
                     </pic:cNvPicPr>
                   </pic:nvPicPr>
                   <pic:blipFill>
-                    <a:blip r:embed="rId32"/>
+                    <a:blip r:embed="rId31"/>
                     <a:stretch>
                       <a:fillRect/>
                     </a:stretch>
@@ -2050,7 +1847,7 @@
                   <pic:spPr bwMode="auto">
                     <a:xfrm>
                       <a:off x="0" y="0"/>
-                      <a:ext cx="4859999" cy="3887999"/>
+                      <a:ext cx="4286250" cy="3429000"/>
                     </a:xfrm>
                     <a:prstGeom prst="rect">
                       <a:avLst/>
@@ -2074,7 +1871,7 @@
         <w:pStyle w:val="ImageCaption"/>
       </w:pPr>
       <w:r>
-        <w:t xml:space="preserve">Precision-recall curves illustrating the trade-off for minority classes.</w:t>
+        <w:t xml:space="preserve">Precision Recall Curve</w:t>
       </w:r>
     </w:p>
     <w:p>
@@ -2092,46 +1889,17 @@
         <w:t xml:space="preserve"> </w:t>
       </w:r>
       <w:r>
-        <w:t xml:space="preserve">The tight clustering among the leading models indicates a strong capacity to maintain high precision without sacrificing recall, which is essential for handling minority classes like</w:t>
-      </w:r>
-      <w:r>
-        <w:t xml:space="preserve"> </w:t>
-      </w:r>
-      <w:r>
-        <w:rPr>
-          <w:i/>
-          <w:iCs/>
-        </w:rPr>
-        <w:t xml:space="preserve">fear</w:t>
-      </w:r>
-      <w:r>
-        <w:t xml:space="preserve"> </w:t>
-      </w:r>
-      <w:r>
-        <w:t xml:space="preserve">and</w:t>
-      </w:r>
-      <w:r>
-        <w:t xml:space="preserve"> </w:t>
-      </w:r>
-      <w:r>
-        <w:rPr>
-          <w:i/>
-          <w:iCs/>
-        </w:rPr>
-        <w:t xml:space="preserve">surprise</w:t>
-      </w:r>
-      <w:r>
-        <w:t xml:space="preserve">.</w:t>
-      </w:r>
-    </w:p>
-    <w:bookmarkEnd w:id="35"/>
-    <w:bookmarkStart w:id="39" w:name="radar-chart"/>
+        <w:t xml:space="preserve">The tight clustering among the leading models indicates a strong capacity to maintain high precision without sacrificing recall, which is essential for handling minority classes like fear and surprise.</w:t>
+      </w:r>
+    </w:p>
+    <w:bookmarkEnd w:id="34"/>
+    <w:bookmarkStart w:id="38" w:name="radar-chart"/>
     <w:p>
       <w:pPr>
         <w:pStyle w:val="Heading3"/>
       </w:pPr>
       <w:r>
-        <w:t xml:space="preserve">4.5 Radar Chart</w:t>
+        <w:t xml:space="preserve">5. Radar Chart</w:t>
       </w:r>
     </w:p>
     <w:p>
@@ -2141,20 +1909,20 @@
       <w:r>
         <w:drawing>
           <wp:inline>
-            <wp:extent cx="4859999" cy="4249625"/>
+            <wp:extent cx="4286250" cy="3747933"/>
             <wp:effectExtent b="0" l="0" r="0" t="0"/>
-            <wp:docPr descr="Multi-metric radar footprint of the baseline models." title="" id="37" name="Picture"/>
+            <wp:docPr descr="Radar Chart" title="" id="36" name="Picture"/>
             <a:graphic>
               <a:graphicData uri="http://schemas.openxmlformats.org/drawingml/2006/picture">
                 <pic:pic>
                   <pic:nvPicPr>
-                    <pic:cNvPr descr="results/results/paper_figures/5_radar_chart.png" id="38" name="Picture"/>
+                    <pic:cNvPr descr="results/results/paper_figures/5_radar_chart.png" id="37" name="Picture"/>
                     <pic:cNvPicPr>
                       <a:picLocks noChangeArrowheads="1" noChangeAspect="1"/>
                     </pic:cNvPicPr>
                   </pic:nvPicPr>
                   <pic:blipFill>
-                    <a:blip r:embed="rId36"/>
+                    <a:blip r:embed="rId35"/>
                     <a:stretch>
                       <a:fillRect/>
                     </a:stretch>
@@ -2162,7 +1930,7 @@
                   <pic:spPr bwMode="auto">
                     <a:xfrm>
                       <a:off x="0" y="0"/>
-                      <a:ext cx="4859999" cy="4249625"/>
+                      <a:ext cx="4286250" cy="3747933"/>
                     </a:xfrm>
                     <a:prstGeom prst="rect">
                       <a:avLst/>
@@ -2186,7 +1954,7 @@
         <w:pStyle w:val="ImageCaption"/>
       </w:pPr>
       <w:r>
-        <w:t xml:space="preserve">Multi-metric radar footprint of the baseline models.</w:t>
+        <w:t xml:space="preserve">Radar Chart</w:t>
       </w:r>
     </w:p>
     <w:p>
@@ -2207,14 +1975,14 @@
         <w:t xml:space="preserve">The multi-metric footprint visually confirms the well-rounded performance of the top baseline models, establishing the target performance threshold for our future hybrid architecture.</w:t>
       </w:r>
     </w:p>
-    <w:bookmarkEnd w:id="39"/>
-    <w:bookmarkStart w:id="43" w:name="where-the-best-baseline-struggles"/>
+    <w:bookmarkEnd w:id="38"/>
+    <w:bookmarkStart w:id="42" w:name="where-the-best-baseline-struggles"/>
     <w:p>
       <w:pPr>
         <w:pStyle w:val="Heading3"/>
       </w:pPr>
       <w:r>
-        <w:t xml:space="preserve">4.6 Where the Best Baseline Struggles</w:t>
+        <w:t xml:space="preserve">6. Where the Best Baseline Struggles</w:t>
       </w:r>
     </w:p>
     <w:p>
@@ -2224,20 +1992,20 @@
       <w:r>
         <w:drawing>
           <wp:inline>
-            <wp:extent cx="4859999" cy="3887999"/>
+            <wp:extent cx="4286250" cy="3429000"/>
             <wp:effectExtent b="0" l="0" r="0" t="0"/>
-            <wp:docPr descr="Out-of-fold confusion matrix for the best baseline (VGG-16)." title="" id="41" name="Picture"/>
+            <wp:docPr descr="Best Model Confusion Matrix" title="" id="40" name="Picture"/>
             <a:graphic>
               <a:graphicData uri="http://schemas.openxmlformats.org/drawingml/2006/picture">
                 <pic:pic>
                   <pic:nvPicPr>
-                    <pic:cNvPr descr="results/results/paper_figures/6_best_model_oof_cm.png" id="42" name="Picture"/>
+                    <pic:cNvPr descr="results/results/paper_figures/6_best_model_oof_cm.png" id="41" name="Picture"/>
                     <pic:cNvPicPr>
                       <a:picLocks noChangeArrowheads="1" noChangeAspect="1"/>
                     </pic:cNvPicPr>
                   </pic:nvPicPr>
                   <pic:blipFill>
-                    <a:blip r:embed="rId40"/>
+                    <a:blip r:embed="rId39"/>
                     <a:stretch>
                       <a:fillRect/>
                     </a:stretch>
@@ -2245,7 +2013,7 @@
                   <pic:spPr bwMode="auto">
                     <a:xfrm>
                       <a:off x="0" y="0"/>
-                      <a:ext cx="4859999" cy="3887999"/>
+                      <a:ext cx="4286250" cy="3429000"/>
                     </a:xfrm>
                     <a:prstGeom prst="rect">
                       <a:avLst/>
@@ -2269,7 +2037,7 @@
         <w:pStyle w:val="ImageCaption"/>
       </w:pPr>
       <w:r>
-        <w:t xml:space="preserve">Out-of-fold confusion matrix for the best baseline (VGG-16).</w:t>
+        <w:t xml:space="preserve">Best Model Confusion Matrix</w:t>
       </w:r>
     </w:p>
     <w:p>
@@ -2293,11 +2061,7 @@
         <w:t xml:space="preserve"> </w:t>
       </w:r>
       <w:r>
-        <w:rPr>
-          <w:i/>
-          <w:iCs/>
-        </w:rPr>
-        <w:t xml:space="preserve">fear</w:t>
+        <w:t xml:space="preserve">“Fear”</w:t>
       </w:r>
       <w:r>
         <w:t xml:space="preserve"> </w:t>
@@ -2309,24 +2073,23 @@
         <w:t xml:space="preserve"> </w:t>
       </w:r>
       <w:r>
-        <w:rPr>
-          <w:i/>
-          <w:iCs/>
-        </w:rPr>
-        <w:t xml:space="preserve">surprise</w:t>
-      </w:r>
-      <w:r>
-        <w:t xml:space="preserve">. Addressing these specific misclassifications will be a primary goal of our proposed hybrid model.</w:t>
-      </w:r>
-    </w:p>
-    <w:bookmarkEnd w:id="43"/>
-    <w:bookmarkStart w:id="47" w:name="feature-correlation-analysis"/>
+        <w:t xml:space="preserve">“Surprise.”</w:t>
+      </w:r>
+      <w:r>
+        <w:t xml:space="preserve"> </w:t>
+      </w:r>
+      <w:r>
+        <w:t xml:space="preserve">Addressing these specific misclassifications will be a primary goal of our proposed hybrid model.</w:t>
+      </w:r>
+    </w:p>
+    <w:bookmarkEnd w:id="42"/>
+    <w:bookmarkStart w:id="46" w:name="feature-correlation-analysis"/>
     <w:p>
       <w:pPr>
         <w:pStyle w:val="Heading3"/>
       </w:pPr>
       <w:r>
-        <w:t xml:space="preserve">4.7 Feature Correlation Analysis</w:t>
+        <w:t xml:space="preserve">7. Feature Correlation Analysis</w:t>
       </w:r>
     </w:p>
     <w:p>
@@ -2336,20 +2099,20 @@
       <w:r>
         <w:drawing>
           <wp:inline>
-            <wp:extent cx="4859999" cy="4049999"/>
+            <wp:extent cx="4286250" cy="3571875"/>
             <wp:effectExtent b="0" l="0" r="0" t="0"/>
-            <wp:docPr descr="Correlation heatmap between model predictions." title="" id="45" name="Picture"/>
+            <wp:docPr descr="Model Correlation Heatmap" title="" id="44" name="Picture"/>
             <a:graphic>
               <a:graphicData uri="http://schemas.openxmlformats.org/drawingml/2006/picture">
                 <pic:pic>
                   <pic:nvPicPr>
-                    <pic:cNvPr descr="results/results/paper_figures/7_model_correlation_heatmap.png" id="46" name="Picture"/>
+                    <pic:cNvPr descr="results/results/paper_figures/7_model_correlation_heatmap.png" id="45" name="Picture"/>
                     <pic:cNvPicPr>
                       <a:picLocks noChangeArrowheads="1" noChangeAspect="1"/>
                     </pic:cNvPicPr>
                   </pic:nvPicPr>
                   <pic:blipFill>
-                    <a:blip r:embed="rId44"/>
+                    <a:blip r:embed="rId43"/>
                     <a:stretch>
                       <a:fillRect/>
                     </a:stretch>
@@ -2357,7 +2120,7 @@
                   <pic:spPr bwMode="auto">
                     <a:xfrm>
                       <a:off x="0" y="0"/>
-                      <a:ext cx="4859999" cy="4049999"/>
+                      <a:ext cx="4286250" cy="3571875"/>
                     </a:xfrm>
                     <a:prstGeom prst="rect">
                       <a:avLst/>
@@ -2381,7 +2144,7 @@
         <w:pStyle w:val="ImageCaption"/>
       </w:pPr>
       <w:r>
-        <w:t xml:space="preserve">Correlation heatmap between model predictions.</w:t>
+        <w:t xml:space="preserve">Model Correlation Heatmap</w:t>
       </w:r>
     </w:p>
     <w:p>
@@ -2402,16 +2165,8 @@
         <w:t xml:space="preserve">The correlation heatmap indicates that CNN- and Transformer-based models capture different aspects of facial features. This complementary observation directly motivates our plan to design a hybrid CNN-Transformer architecture in the next phase of the research.</w:t>
       </w:r>
     </w:p>
-    <w:p>
-      <w:r>
-        <w:pict>
-          <v:rect style="width:0;height:1.5pt" o:hralign="center" o:hrstd="t" o:hr="t"/>
-        </w:pict>
-      </w:r>
-    </w:p>
-    <w:bookmarkEnd w:id="47"/>
-    <w:bookmarkEnd w:id="48"/>
-    <w:bookmarkStart w:id="49" w:name="kaggle-training-implementation"/>
+    <w:bookmarkEnd w:id="46"/>
+    <w:bookmarkStart w:id="48" w:name="kaggle-training-implementation"/>
     <w:p>
       <w:pPr>
         <w:pStyle w:val="Heading2"/>
@@ -2425,7 +2180,7 @@
         <w:pStyle w:val="FirstParagraph"/>
       </w:pPr>
       <w:r>
-        <w:t xml:space="preserve">The baseline benchmarking was executed entirely on Kaggle GPU instances using the standalone script</w:t>
+        <w:t xml:space="preserve">We ran the baseline benchmarks on Kaggle GPUs using the standalone script</w:t>
       </w:r>
       <w:r>
         <w:t xml:space="preserve"> </w:t>
@@ -2437,7 +2192,21 @@
         <w:t xml:space="preserve">kaggle/run_all_models.py</w:t>
       </w:r>
       <w:r>
-        <w:t xml:space="preserve">. The training process was designed specifically to handle the small scale and imbalance of our ASD dataset while mitigating Kaggle session timeouts.</w:t>
+        <w:t xml:space="preserve">. You can view and run the full experimental pipeline in our</w:t>
+      </w:r>
+      <w:r>
+        <w:t xml:space="preserve"> </w:t>
+      </w:r>
+      <w:hyperlink r:id="rId47">
+        <w:r>
+          <w:rPr>
+            <w:rStyle w:val="Hyperlink"/>
+          </w:rPr>
+          <w:t xml:space="preserve">Kaggle Notebook</w:t>
+        </w:r>
+      </w:hyperlink>
+      <w:r>
+        <w:t xml:space="preserve">. The training pipeline was customized for our dataset:</w:t>
       </w:r>
     </w:p>
     <w:p>
@@ -2445,7 +2214,7 @@
         <w:pStyle w:val="Compact"/>
         <w:numPr>
           <w:ilvl w:val="0"/>
-          <w:numId w:val="1002"/>
+          <w:numId w:val="1001"/>
         </w:numPr>
       </w:pPr>
       <w:r>
@@ -2453,26 +2222,22 @@
           <w:b/>
           <w:bCs/>
         </w:rPr>
-        <w:t xml:space="preserve">Stratified 5-Fold CV:</w:t>
+        <w:t xml:space="preserve">5-Fold Cross-Validation:</w:t>
       </w:r>
       <w:r>
         <w:t xml:space="preserve"> </w:t>
       </w:r>
       <w:r>
-        <w:t xml:space="preserve">All models were evaluated using Stratified 5-Fold Cross-Validation on the raw images. This ensures every image is predicted exactly once out-of-fold (OOF), making metrics for rare classes (like</w:t>
+        <w:t xml:space="preserve">We used Stratified 5-Fold CV on the raw images so every image is tested exactly once. This gives us reliable metrics even for rare emotions like</w:t>
       </w:r>
       <w:r>
         <w:t xml:space="preserve"> </w:t>
       </w:r>
       <w:r>
-        <w:rPr>
-          <w:i/>
-          <w:iCs/>
-        </w:rPr>
-        <w:t xml:space="preserve">fear</w:t>
-      </w:r>
-      <w:r>
-        <w:t xml:space="preserve">) statistically defensible.</w:t>
+        <w:t xml:space="preserve">“Fear”</w:t>
+      </w:r>
+      <w:r>
+        <w:t xml:space="preserve">.</w:t>
       </w:r>
     </w:p>
     <w:p>
@@ -2480,7 +2245,7 @@
         <w:pStyle w:val="Compact"/>
         <w:numPr>
           <w:ilvl w:val="0"/>
-          <w:numId w:val="1002"/>
+          <w:numId w:val="1001"/>
         </w:numPr>
       </w:pPr>
       <w:r>
@@ -2488,61 +2253,13 @@
           <w:b/>
           <w:bCs/>
         </w:rPr>
-        <w:t xml:space="preserve">Differential Learning Rates:</w:t>
+        <w:t xml:space="preserve">Careful Learning Rates:</w:t>
       </w:r>
       <w:r>
         <w:t xml:space="preserve"> </w:t>
       </w:r>
       <w:r>
-        <w:t xml:space="preserve">To prevent destabilizing pretrained weights, we applied a differential learning rate (the backbone uses</w:t>
-      </w:r>
-      <w:r>
-        <w:t xml:space="preserve"> </w:t>
-      </w:r>
-      <w:r>
-        <w:rPr>
-          <w:rStyle w:val="VerbatimChar"/>
-        </w:rPr>
-        <w:t xml:space="preserve">lr * 0.1</w:t>
-      </w:r>
-      <w:r>
-        <w:t xml:space="preserve">, while the head uses full</w:t>
-      </w:r>
-      <w:r>
-        <w:t xml:space="preserve"> </w:t>
-      </w:r>
-      <w:r>
-        <w:rPr>
-          <w:rStyle w:val="VerbatimChar"/>
-        </w:rPr>
-        <w:t xml:space="preserve">lr</w:t>
-      </w:r>
-      <w:r>
-        <w:t xml:space="preserve">). Transformers were trained conservatively (</w:t>
-      </w:r>
-      <w:r>
-        <w:rPr>
-          <w:rStyle w:val="VerbatimChar"/>
-        </w:rPr>
-        <w:t xml:space="preserve">lr=1e-4</w:t>
-      </w:r>
-      <w:r>
-        <w:t xml:space="preserve"> </w:t>
-      </w:r>
-      <w:r>
-        <w:t xml:space="preserve">with Label-Smoothed Cross-Entropy), while standard CNNs were trained more aggressively (</w:t>
-      </w:r>
-      <w:r>
-        <w:rPr>
-          <w:rStyle w:val="VerbatimChar"/>
-        </w:rPr>
-        <w:t xml:space="preserve">lr=1e-3</w:t>
-      </w:r>
-      <w:r>
-        <w:t xml:space="preserve"> </w:t>
-      </w:r>
-      <w:r>
-        <w:t xml:space="preserve">with Focal Loss).</w:t>
+        <w:t xml:space="preserve">We trained the pretrained backbone layers very slowly (10x slower than the classification head) to avoid losing their learned features.</w:t>
       </w:r>
     </w:p>
     <w:p>
@@ -2550,7 +2267,7 @@
         <w:pStyle w:val="Compact"/>
         <w:numPr>
           <w:ilvl w:val="0"/>
-          <w:numId w:val="1002"/>
+          <w:numId w:val="1001"/>
         </w:numPr>
       </w:pPr>
       <w:r>
@@ -2558,13 +2275,13 @@
           <w:b/>
           <w:bCs/>
         </w:rPr>
-        <w:t xml:space="preserve">Handling Class Imbalance:</w:t>
+        <w:t xml:space="preserve">Handling Imbalance:</w:t>
       </w:r>
       <w:r>
         <w:t xml:space="preserve"> </w:t>
       </w:r>
       <w:r>
-        <w:t xml:space="preserve">To avoid over-regularizing small models via loss weighting, the severe class imbalance was handled strictly via a</w:t>
+        <w:t xml:space="preserve">To fix the severe class imbalance, we oversampled rare classes during training using a</w:t>
       </w:r>
       <w:r>
         <w:t xml:space="preserve"> </w:t>
@@ -2579,7 +2296,7 @@
         <w:t xml:space="preserve"> </w:t>
       </w:r>
       <w:r>
-        <w:t xml:space="preserve">at the DataLoader level.</w:t>
+        <w:t xml:space="preserve">instead of heavily weighting the loss function.</w:t>
       </w:r>
     </w:p>
     <w:p>
@@ -2587,7 +2304,7 @@
         <w:pStyle w:val="Compact"/>
         <w:numPr>
           <w:ilvl w:val="0"/>
-          <w:numId w:val="1002"/>
+          <w:numId w:val="1001"/>
         </w:numPr>
       </w:pPr>
       <w:r>
@@ -2595,13 +2312,13 @@
           <w:b/>
           <w:bCs/>
         </w:rPr>
-        <w:t xml:space="preserve">Generalization (EMA &amp; AMP):</w:t>
+        <w:t xml:space="preserve">On-the-Fly Augmentation:</w:t>
       </w:r>
       <w:r>
         <w:t xml:space="preserve"> </w:t>
       </w:r>
       <w:r>
-        <w:t xml:space="preserve">Mixed-precision training (AMP) accelerated execution on the GPU, while an Exponential Moving Average (EMA) of model weights was maintained to boost final generalization.</w:t>
+        <w:t xml:space="preserve">We applied lightweight, dynamic data augmentations (random flips, rotations, scaling, and color jitter) during training. Heavy augmentations (like MixUp) were intentionally excluded to preserve delicate facial features.</w:t>
       </w:r>
     </w:p>
     <w:p>
@@ -2609,7 +2326,7 @@
         <w:pStyle w:val="Compact"/>
         <w:numPr>
           <w:ilvl w:val="0"/>
-          <w:numId w:val="1002"/>
+          <w:numId w:val="1001"/>
         </w:numPr>
       </w:pPr>
       <w:r>
@@ -2617,31 +2334,13 @@
           <w:b/>
           <w:bCs/>
         </w:rPr>
-        <w:t xml:space="preserve">Timeout-Resilient Execution:</w:t>
+        <w:t xml:space="preserve">Stable Training:</w:t>
       </w:r>
       <w:r>
         <w:t xml:space="preserve"> </w:t>
       </w:r>
       <w:r>
-        <w:t xml:space="preserve">Because Kaggle sessions often time out during long sweeps, the script is inherently resumable. It incrementally persists OOF predictions (</w:t>
-      </w:r>
-      <w:r>
-        <w:rPr>
-          <w:rStyle w:val="VerbatimChar"/>
-        </w:rPr>
-        <w:t xml:space="preserve">.npy</w:t>
-      </w:r>
-      <w:r>
-        <w:t xml:space="preserve">) and performance metrics (</w:t>
-      </w:r>
-      <w:r>
-        <w:rPr>
-          <w:rStyle w:val="VerbatimChar"/>
-        </w:rPr>
-        <w:t xml:space="preserve">cv_metrics.json</w:t>
-      </w:r>
-      <w:r>
-        <w:t xml:space="preserve">) to disk after every single fold. If a session is interrupted, re-running the script automatically skips completed folds and resumes exactly where it stopped.</w:t>
+        <w:t xml:space="preserve">We used mixed-precision (AMP) for faster GPU training and an Exponential Moving Average (EMA) to help the models generalize better.</w:t>
       </w:r>
     </w:p>
     <w:p>
@@ -2649,7 +2348,7 @@
         <w:pStyle w:val="Compact"/>
         <w:numPr>
           <w:ilvl w:val="0"/>
-          <w:numId w:val="1002"/>
+          <w:numId w:val="1001"/>
         </w:numPr>
       </w:pPr>
       <w:r>
@@ -2657,126 +2356,39 @@
           <w:b/>
           <w:bCs/>
         </w:rPr>
-        <w:t xml:space="preserve">Automated Figure Generation:</w:t>
+        <w:t xml:space="preserve">Resumable:</w:t>
       </w:r>
       <w:r>
         <w:t xml:space="preserve"> </w:t>
       </w:r>
       <w:r>
-        <w:t xml:space="preserve">Upon completion, the script automatically parses the finalized OOF arrays to generate all of the comparative graphs (ROC, PR Curve, Radar Chart, Heatmaps) featured in this report.</w:t>
-      </w:r>
-    </w:p>
-    <w:p>
-      <w:r>
-        <w:pict>
-          <v:rect style="width:0;height:1.5pt" o:hralign="center" o:hrstd="t" o:hr="t"/>
-        </w:pict>
-      </w:r>
-    </w:p>
-    <w:bookmarkEnd w:id="49"/>
-    <w:bookmarkStart w:id="50" w:name="conclusion-next-steps"/>
-    <w:p>
-      <w:pPr>
-        <w:pStyle w:val="Heading2"/>
-      </w:pPr>
-      <w:r>
-        <w:t xml:space="preserve">6. Conclusion &amp; Next Steps</w:t>
-      </w:r>
-    </w:p>
-    <w:p>
-      <w:pPr>
-        <w:pStyle w:val="FirstParagraph"/>
-      </w:pPr>
-      <w:r>
-        <w:t xml:space="preserve">The benchmark confirms that pretrained CNN and Transformer baselines perform competitively on the ASD emotion-classification task, with</w:t>
-      </w:r>
-      <w:r>
-        <w:t xml:space="preserve"> </w:t>
-      </w:r>
+        <w:t xml:space="preserve">Since Kaggle sessions often timeout, the script automatically saves its progress after every fold. If it crashes, restarting the script picks up exactly where it left off.</w:t>
+      </w:r>
+    </w:p>
+    <w:p>
+      <w:pPr>
+        <w:pStyle w:val="Compact"/>
+        <w:numPr>
+          <w:ilvl w:val="0"/>
+          <w:numId w:val="1001"/>
+        </w:numPr>
+      </w:pPr>
       <w:r>
         <w:rPr>
           <w:b/>
           <w:bCs/>
         </w:rPr>
-        <w:t xml:space="preserve">VGG-16</w:t>
+        <w:t xml:space="preserve">Auto-Generated Charts:</w:t>
       </w:r>
       <w:r>
         <w:t xml:space="preserve"> </w:t>
       </w:r>
       <w:r>
-        <w:t xml:space="preserve">and</w:t>
-      </w:r>
-      <w:r>
-        <w:t xml:space="preserve"> </w:t>
-      </w:r>
-      <w:r>
-        <w:rPr>
-          <w:b/>
-          <w:bCs/>
-        </w:rPr>
-        <w:t xml:space="preserve">Swin Base</w:t>
-      </w:r>
-      <w:r>
-        <w:t xml:space="preserve"> </w:t>
-      </w:r>
-      <w:r>
-        <w:t xml:space="preserve">leading on the majority of metrics. The main remaining weakness is misclassification between the rare and visually similar</w:t>
-      </w:r>
-      <w:r>
-        <w:t xml:space="preserve"> </w:t>
-      </w:r>
-      <w:r>
-        <w:rPr>
-          <w:i/>
-          <w:iCs/>
-        </w:rPr>
-        <w:t xml:space="preserve">fear</w:t>
-      </w:r>
-      <w:r>
-        <w:t xml:space="preserve"> </w:t>
-      </w:r>
-      <w:r>
-        <w:t xml:space="preserve">and</w:t>
-      </w:r>
-      <w:r>
-        <w:t xml:space="preserve"> </w:t>
-      </w:r>
-      <w:r>
-        <w:rPr>
-          <w:i/>
-          <w:iCs/>
-        </w:rPr>
-        <w:t xml:space="preserve">surprise</w:t>
-      </w:r>
-      <w:r>
-        <w:t xml:space="preserve"> </w:t>
-      </w:r>
-      <w:r>
-        <w:t xml:space="preserve">classes.</w:t>
-      </w:r>
-    </w:p>
-    <w:p>
-      <w:pPr>
-        <w:pStyle w:val="BodyText"/>
-      </w:pPr>
-      <w:r>
-        <w:t xml:space="preserve">The correlation analysis reveals complementary behavior between CNN- and Transformer-based models. This motivates the</w:t>
-      </w:r>
-      <w:r>
-        <w:t xml:space="preserve"> </w:t>
-      </w:r>
-      <w:r>
-        <w:rPr>
-          <w:b/>
-          <w:bCs/>
-        </w:rPr>
-        <w:t xml:space="preserve">next phase</w:t>
-      </w:r>
-      <w:r>
-        <w:t xml:space="preserve">: designing and training a hybrid CNN-Transformer (dual-stream) architecture that combines the spatial detail of CNNs with the global context of Transformers, explicitly targeting the minority-class errors highlighted in this report.</w:t>
-      </w:r>
-    </w:p>
-    <w:bookmarkEnd w:id="50"/>
+        <w:t xml:space="preserve">Once finished, the script automatically generates all the performance charts (ROC, Radar, etc.) shown in this report.</w:t>
+      </w:r>
+    </w:p>
+    <w:bookmarkEnd w:id="48"/>
+    <w:bookmarkEnd w:id="49"/>
     <w:sectPr>
       <w:footnotePr>
         <w:numRestart w:val="eachSect"/>
@@ -2994,9 +2606,6 @@
     <w:abstractNumId w:val="990"/>
   </w:num>
   <w:num w:numId="1001">
-    <w:abstractNumId w:val="991"/>
-  </w:num>
-  <w:num w:numId="1002">
     <w:abstractNumId w:val="991"/>
   </w:num>
 </w:numbering>

</xml_diff>